<commit_message>
Adding Socket.Io Notes With NodeJS And React
</commit_message>
<xml_diff>
--- a/Nodejs/NodeJS-With-Socket.IO-Notes/NodeJS-Socket.IO-Server-And-Client-Notes-01.docx
+++ b/Nodejs/NodeJS-With-Socket.IO-Notes/NodeJS-Socket.IO-Server-And-Client-Notes-01.docx
@@ -78,7 +78,19 @@
           <w:szCs w:val="21"/>
           <w14:ligatures w14:val="none"/>
         </w:rPr>
-        <w:t xml:space="preserve"> { </w:t>
+        <w:t xml:space="preserve"> </w:t>
+      </w:r>
+      <w:proofErr w:type="gramStart"/>
+      <w:r>
+        <w:rPr>
+          <w:rFonts w:ascii="Consolas" w:eastAsia="Times New Roman" w:hAnsi="Consolas" w:cs="Times New Roman"/>
+          <w:color w:val="202020"/>
+          <w:kern w:val="0"/>
+          <w:sz w:val="21"/>
+          <w:szCs w:val="21"/>
+          <w14:ligatures w14:val="none"/>
+        </w:rPr>
+        <w:t xml:space="preserve">{ </w:t>
       </w:r>
       <w:r>
         <w:rPr>
@@ -91,6 +103,7 @@
         </w:rPr>
         <w:t>Server</w:t>
       </w:r>
+      <w:proofErr w:type="gramEnd"/>
       <w:r>
         <w:rPr>
           <w:rFonts w:ascii="Consolas" w:eastAsia="Times New Roman" w:hAnsi="Consolas" w:cs="Times New Roman"/>
@@ -284,6 +297,7 @@
         </w:rPr>
         <w:t xml:space="preserve"> </w:t>
       </w:r>
+      <w:proofErr w:type="gramStart"/>
       <w:r>
         <w:rPr>
           <w:rFonts w:ascii="Consolas" w:eastAsia="Times New Roman" w:hAnsi="Consolas" w:cs="Times New Roman"/>
@@ -306,6 +320,7 @@
         </w:rPr>
         <w:t>(</w:t>
       </w:r>
+      <w:proofErr w:type="gramEnd"/>
       <w:r>
         <w:rPr>
           <w:rFonts w:ascii="Consolas" w:eastAsia="Times New Roman" w:hAnsi="Consolas" w:cs="Times New Roman"/>
@@ -326,7 +341,19 @@
           <w:szCs w:val="21"/>
           <w14:ligatures w14:val="none"/>
         </w:rPr>
-        <w:t xml:space="preserve">, { </w:t>
+        <w:t xml:space="preserve">, </w:t>
+      </w:r>
+      <w:proofErr w:type="gramStart"/>
+      <w:r>
+        <w:rPr>
+          <w:rFonts w:ascii="Consolas" w:eastAsia="Times New Roman" w:hAnsi="Consolas" w:cs="Times New Roman"/>
+          <w:color w:val="202020"/>
+          <w:kern w:val="0"/>
+          <w:sz w:val="21"/>
+          <w:szCs w:val="21"/>
+          <w14:ligatures w14:val="none"/>
+        </w:rPr>
+        <w:t xml:space="preserve">{ </w:t>
       </w:r>
       <w:r>
         <w:rPr>
@@ -339,6 +366,7 @@
         </w:rPr>
         <w:t>cors</w:t>
       </w:r>
+      <w:proofErr w:type="gramEnd"/>
       <w:r>
         <w:rPr>
           <w:rFonts w:ascii="Consolas" w:eastAsia="Times New Roman" w:hAnsi="Consolas" w:cs="Times New Roman"/>
@@ -370,7 +398,19 @@
           <w:szCs w:val="21"/>
           <w14:ligatures w14:val="none"/>
         </w:rPr>
-        <w:t>"http://localhost:5173"</w:t>
+        <w:t>"http://localhost:5173</w:t>
+      </w:r>
+      <w:proofErr w:type="gramStart"/>
+      <w:r>
+        <w:rPr>
+          <w:rFonts w:ascii="Consolas" w:eastAsia="Times New Roman" w:hAnsi="Consolas" w:cs="Times New Roman"/>
+          <w:color w:val="0A3069"/>
+          <w:kern w:val="0"/>
+          <w:sz w:val="21"/>
+          <w:szCs w:val="21"/>
+          <w14:ligatures w14:val="none"/>
+        </w:rPr>
+        <w:t>"</w:t>
       </w:r>
       <w:r>
         <w:rPr>
@@ -392,7 +432,19 @@
           <w:szCs w:val="21"/>
           <w14:ligatures w14:val="none"/>
         </w:rPr>
-        <w:t>});</w:t>
+        <w:t>}</w:t>
+      </w:r>
+      <w:proofErr w:type="gramEnd"/>
+      <w:r>
+        <w:rPr>
+          <w:rFonts w:ascii="Consolas" w:eastAsia="Times New Roman" w:hAnsi="Consolas" w:cs="Times New Roman"/>
+          <w:color w:val="202020"/>
+          <w:kern w:val="0"/>
+          <w:sz w:val="21"/>
+          <w:szCs w:val="21"/>
+          <w14:ligatures w14:val="none"/>
+        </w:rPr>
+        <w:t>);</w:t>
       </w:r>
     </w:p>
     <w:p>
@@ -469,6 +521,7 @@
           <w14:ligatures w14:val="none"/>
         </w:rPr>
       </w:pPr>
+      <w:proofErr w:type="gramStart"/>
       <w:r>
         <w:rPr>
           <w:rFonts w:ascii="Consolas" w:eastAsia="Times New Roman" w:hAnsi="Consolas" w:cs="Times New Roman"/>
@@ -502,6 +555,7 @@
         </w:rPr>
         <w:t>on</w:t>
       </w:r>
+      <w:proofErr w:type="gramEnd"/>
       <w:r>
         <w:rPr>
           <w:rFonts w:ascii="Consolas" w:eastAsia="Times New Roman" w:hAnsi="Consolas" w:cs="Times New Roman"/>
@@ -615,6 +669,7 @@
         </w:rPr>
         <w:t xml:space="preserve">    </w:t>
       </w:r>
+      <w:proofErr w:type="gramStart"/>
       <w:r>
         <w:rPr>
           <w:rFonts w:ascii="Consolas" w:eastAsia="Times New Roman" w:hAnsi="Consolas" w:cs="Times New Roman"/>
@@ -648,6 +703,7 @@
         </w:rPr>
         <w:t>on</w:t>
       </w:r>
+      <w:proofErr w:type="gramEnd"/>
       <w:r>
         <w:rPr>
           <w:rFonts w:ascii="Consolas" w:eastAsia="Times New Roman" w:hAnsi="Consolas" w:cs="Times New Roman"/>
@@ -816,6 +872,7 @@
         </w:rPr>
         <w:t xml:space="preserve"> </w:t>
       </w:r>
+      <w:proofErr w:type="gramStart"/>
       <w:r>
         <w:rPr>
           <w:rFonts w:ascii="Consolas" w:eastAsia="Times New Roman" w:hAnsi="Consolas" w:cs="Times New Roman"/>
@@ -849,6 +906,7 @@
         </w:rPr>
         <w:t>!=</w:t>
       </w:r>
+      <w:proofErr w:type="gramEnd"/>
       <w:r>
         <w:rPr>
           <w:rFonts w:ascii="Consolas" w:eastAsia="Times New Roman" w:hAnsi="Consolas" w:cs="Times New Roman"/>
@@ -921,6 +979,7 @@
         </w:rPr>
         <w:t xml:space="preserve">        </w:t>
       </w:r>
+      <w:proofErr w:type="gramStart"/>
       <w:r>
         <w:rPr>
           <w:rFonts w:ascii="Consolas" w:eastAsia="Times New Roman" w:hAnsi="Consolas" w:cs="Times New Roman"/>
@@ -954,6 +1013,7 @@
         </w:rPr>
         <w:t>emit</w:t>
       </w:r>
+      <w:proofErr w:type="gramEnd"/>
       <w:r>
         <w:rPr>
           <w:rFonts w:ascii="Consolas" w:eastAsia="Times New Roman" w:hAnsi="Consolas" w:cs="Times New Roman"/>
@@ -1018,7 +1078,7 @@
         <w:shd w:val="clear" w:color="auto" w:fill="FFFFFF"/>
         <w:spacing w:after="0" w:line="285" w:lineRule="atLeast"/>
         <w:rPr>
-          <w:rFonts w:ascii="Sakkal Majalla" w:eastAsia="Times New Roman" w:hAnsi="Sakkal Majalla" w:cs="Sakkal Majalla" w:hint="cs"/>
+          <w:rFonts w:ascii="Sakkal Majalla" w:eastAsia="Times New Roman" w:hAnsi="Sakkal Majalla" w:cs="Sakkal Majalla"/>
           <w:color w:val="202020"/>
           <w:kern w:val="0"/>
           <w14:ligatures w14:val="none"/>
@@ -1105,6 +1165,7 @@
           <w14:ligatures w14:val="none"/>
         </w:rPr>
       </w:pPr>
+      <w:proofErr w:type="gramStart"/>
       <w:r>
         <w:rPr>
           <w:rFonts w:ascii="Consolas" w:eastAsia="Times New Roman" w:hAnsi="Consolas" w:cs="Times New Roman"/>
@@ -1138,6 +1199,7 @@
         </w:rPr>
         <w:t>on</w:t>
       </w:r>
+      <w:proofErr w:type="gramEnd"/>
       <w:r>
         <w:rPr>
           <w:rFonts w:ascii="Consolas" w:eastAsia="Times New Roman" w:hAnsi="Consolas" w:cs="Times New Roman"/>
@@ -1436,6 +1498,7 @@
           <w14:ligatures w14:val="none"/>
         </w:rPr>
       </w:pPr>
+      <w:proofErr w:type="gramStart"/>
       <w:r>
         <w:rPr>
           <w:rFonts w:ascii="Consolas" w:eastAsia="Times New Roman" w:hAnsi="Consolas" w:cs="Times New Roman"/>
@@ -1469,6 +1532,7 @@
         </w:rPr>
         <w:t>emit</w:t>
       </w:r>
+      <w:proofErr w:type="gramEnd"/>
       <w:r>
         <w:rPr>
           <w:rFonts w:ascii="Consolas" w:eastAsia="Times New Roman" w:hAnsi="Consolas" w:cs="Times New Roman"/>
@@ -1586,6 +1650,7 @@
           <w14:ligatures w14:val="none"/>
         </w:rPr>
       </w:pPr>
+      <w:proofErr w:type="gramStart"/>
       <w:r>
         <w:rPr>
           <w:rFonts w:ascii="Consolas" w:eastAsia="Times New Roman" w:hAnsi="Consolas" w:cs="Times New Roman"/>
@@ -1619,6 +1684,7 @@
         </w:rPr>
         <w:t>emit</w:t>
       </w:r>
+      <w:proofErr w:type="gramEnd"/>
       <w:r>
         <w:rPr>
           <w:rFonts w:ascii="Consolas" w:eastAsia="Times New Roman" w:hAnsi="Consolas" w:cs="Times New Roman"/>
@@ -1716,6 +1782,7 @@
         </w:rPr>
         <w:t xml:space="preserve">    </w:t>
       </w:r>
+      <w:proofErr w:type="gramStart"/>
       <w:r>
         <w:rPr>
           <w:rFonts w:ascii="Consolas" w:eastAsia="Times New Roman" w:hAnsi="Consolas" w:cs="Times New Roman"/>
@@ -1749,6 +1816,7 @@
         </w:rPr>
         <w:t>on</w:t>
       </w:r>
+      <w:proofErr w:type="gramEnd"/>
       <w:r>
         <w:rPr>
           <w:rFonts w:ascii="Consolas" w:eastAsia="Times New Roman" w:hAnsi="Consolas" w:cs="Times New Roman"/>
@@ -1992,18 +2060,42 @@
           <w:szCs w:val="21"/>
           <w14:ligatures w14:val="none"/>
         </w:rPr>
-        <w:t>t1</w:t>
-      </w:r>
-      <w:r>
-        <w:rPr>
-          <w:rFonts w:ascii="Consolas" w:eastAsia="Times New Roman" w:hAnsi="Consolas" w:cs="Times New Roman"/>
-          <w:color w:val="1F2328"/>
-          <w:kern w:val="0"/>
-          <w:sz w:val="21"/>
-          <w:szCs w:val="21"/>
-          <w14:ligatures w14:val="none"/>
-        </w:rPr>
-        <w:t xml:space="preserve">.userId </w:t>
+        <w:t>t</w:t>
+      </w:r>
+      <w:proofErr w:type="gramStart"/>
+      <w:r>
+        <w:rPr>
+          <w:rFonts w:ascii="Consolas" w:eastAsia="Times New Roman" w:hAnsi="Consolas" w:cs="Times New Roman"/>
+          <w:color w:val="953800"/>
+          <w:kern w:val="0"/>
+          <w:sz w:val="21"/>
+          <w:szCs w:val="21"/>
+          <w14:ligatures w14:val="none"/>
+        </w:rPr>
+        <w:t>1</w:t>
+      </w:r>
+      <w:r>
+        <w:rPr>
+          <w:rFonts w:ascii="Consolas" w:eastAsia="Times New Roman" w:hAnsi="Consolas" w:cs="Times New Roman"/>
+          <w:color w:val="1F2328"/>
+          <w:kern w:val="0"/>
+          <w:sz w:val="21"/>
+          <w:szCs w:val="21"/>
+          <w14:ligatures w14:val="none"/>
+        </w:rPr>
+        <w:t>.userId</w:t>
+      </w:r>
+      <w:proofErr w:type="gramEnd"/>
+      <w:r>
+        <w:rPr>
+          <w:rFonts w:ascii="Consolas" w:eastAsia="Times New Roman" w:hAnsi="Consolas" w:cs="Times New Roman"/>
+          <w:color w:val="1F2328"/>
+          <w:kern w:val="0"/>
+          <w:sz w:val="21"/>
+          <w:szCs w:val="21"/>
+          <w14:ligatures w14:val="none"/>
+        </w:rPr>
+        <w:t xml:space="preserve"> </w:t>
       </w:r>
       <w:r>
         <w:rPr>
@@ -2027,6 +2119,7 @@
         </w:rPr>
         <w:t xml:space="preserve"> </w:t>
       </w:r>
+      <w:proofErr w:type="gramStart"/>
       <w:r>
         <w:rPr>
           <w:rFonts w:ascii="Consolas" w:eastAsia="Times New Roman" w:hAnsi="Consolas" w:cs="Times New Roman"/>
@@ -2047,7 +2140,19 @@
           <w:szCs w:val="21"/>
           <w14:ligatures w14:val="none"/>
         </w:rPr>
-        <w:t>.recipientId);</w:t>
+        <w:t>.recipientId</w:t>
+      </w:r>
+      <w:proofErr w:type="gramEnd"/>
+      <w:r>
+        <w:rPr>
+          <w:rFonts w:ascii="Consolas" w:eastAsia="Times New Roman" w:hAnsi="Consolas" w:cs="Times New Roman"/>
+          <w:color w:val="1F2328"/>
+          <w:kern w:val="0"/>
+          <w:sz w:val="21"/>
+          <w:szCs w:val="21"/>
+          <w14:ligatures w14:val="none"/>
+        </w:rPr>
+        <w:t>);</w:t>
       </w:r>
     </w:p>
     <w:p>
@@ -2187,6 +2292,7 @@
         </w:rPr>
         <w:t>(</w:t>
       </w:r>
+      <w:proofErr w:type="gramStart"/>
       <w:r>
         <w:rPr>
           <w:rFonts w:ascii="Consolas" w:eastAsia="Times New Roman" w:hAnsi="Consolas" w:cs="Times New Roman"/>
@@ -2220,6 +2326,7 @@
         </w:rPr>
         <w:t>emit</w:t>
       </w:r>
+      <w:proofErr w:type="gramEnd"/>
       <w:r>
         <w:rPr>
           <w:rFonts w:ascii="Consolas" w:eastAsia="Times New Roman" w:hAnsi="Consolas" w:cs="Times New Roman"/>
@@ -2300,6 +2407,7 @@
         </w:rPr>
         <w:t xml:space="preserve">            </w:t>
       </w:r>
+      <w:proofErr w:type="gramStart"/>
       <w:r>
         <w:rPr>
           <w:rFonts w:ascii="Consolas" w:eastAsia="Times New Roman" w:hAnsi="Consolas" w:cs="Times New Roman"/>
@@ -2344,6 +2452,7 @@
         </w:rPr>
         <w:t>(</w:t>
       </w:r>
+      <w:proofErr w:type="gramEnd"/>
       <w:r>
         <w:rPr>
           <w:rFonts w:ascii="Consolas" w:eastAsia="Times New Roman" w:hAnsi="Consolas" w:cs="Times New Roman"/>
@@ -2391,6 +2500,7 @@
         </w:rPr>
         <w:t xml:space="preserve">            </w:t>
       </w:r>
+      <w:proofErr w:type="gramStart"/>
       <w:r>
         <w:rPr>
           <w:rFonts w:ascii="Consolas" w:eastAsia="Times New Roman" w:hAnsi="Consolas" w:cs="Times New Roman"/>
@@ -2435,6 +2545,7 @@
         </w:rPr>
         <w:t>(</w:t>
       </w:r>
+      <w:proofErr w:type="gramEnd"/>
       <w:r>
         <w:rPr>
           <w:rFonts w:ascii="Consolas" w:eastAsia="Times New Roman" w:hAnsi="Consolas" w:cs="Times New Roman"/>
@@ -2457,6 +2568,7 @@
         </w:rPr>
         <w:t xml:space="preserve">, </w:t>
       </w:r>
+      <w:proofErr w:type="gramStart"/>
       <w:r>
         <w:rPr>
           <w:rFonts w:ascii="Consolas" w:eastAsia="Times New Roman" w:hAnsi="Consolas" w:cs="Times New Roman"/>
@@ -2477,7 +2589,19 @@
           <w:szCs w:val="21"/>
           <w14:ligatures w14:val="none"/>
         </w:rPr>
-        <w:t>.sender?._id);</w:t>
+        <w:t>.sender?._</w:t>
+      </w:r>
+      <w:proofErr w:type="gramEnd"/>
+      <w:r>
+        <w:rPr>
+          <w:rFonts w:ascii="Consolas" w:eastAsia="Times New Roman" w:hAnsi="Consolas" w:cs="Times New Roman"/>
+          <w:color w:val="1F2328"/>
+          <w:kern w:val="0"/>
+          <w:sz w:val="21"/>
+          <w:szCs w:val="21"/>
+          <w14:ligatures w14:val="none"/>
+        </w:rPr>
+        <w:t>id);</w:t>
       </w:r>
     </w:p>
     <w:p>
@@ -2504,6 +2628,7 @@
         </w:rPr>
         <w:t xml:space="preserve">            </w:t>
       </w:r>
+      <w:proofErr w:type="gramStart"/>
       <w:r>
         <w:rPr>
           <w:rFonts w:ascii="Consolas" w:eastAsia="Times New Roman" w:hAnsi="Consolas" w:cs="Times New Roman"/>
@@ -2548,6 +2673,7 @@
         </w:rPr>
         <w:t>(</w:t>
       </w:r>
+      <w:proofErr w:type="gramEnd"/>
       <w:r>
         <w:rPr>
           <w:rFonts w:ascii="Consolas" w:eastAsia="Times New Roman" w:hAnsi="Consolas" w:cs="Times New Roman"/>
@@ -2654,6 +2780,7 @@
         </w:rPr>
         <w:t>(</w:t>
       </w:r>
+      <w:proofErr w:type="gramStart"/>
       <w:r>
         <w:rPr>
           <w:rFonts w:ascii="Consolas" w:eastAsia="Times New Roman" w:hAnsi="Consolas" w:cs="Times New Roman"/>
@@ -2687,6 +2814,7 @@
         </w:rPr>
         <w:t>emit</w:t>
       </w:r>
+      <w:proofErr w:type="gramEnd"/>
       <w:r>
         <w:rPr>
           <w:rFonts w:ascii="Consolas" w:eastAsia="Times New Roman" w:hAnsi="Consolas" w:cs="Times New Roman"/>
@@ -2767,6 +2895,7 @@
         </w:rPr>
         <w:t xml:space="preserve"> </w:t>
       </w:r>
+      <w:proofErr w:type="gramStart"/>
       <w:r>
         <w:rPr>
           <w:rFonts w:ascii="Consolas" w:eastAsia="Times New Roman" w:hAnsi="Consolas" w:cs="Times New Roman"/>
@@ -2787,7 +2916,19 @@
           <w:szCs w:val="21"/>
           <w14:ligatures w14:val="none"/>
         </w:rPr>
-        <w:t>.sender?._id,</w:t>
+        <w:t>.sender?._</w:t>
+      </w:r>
+      <w:proofErr w:type="gramEnd"/>
+      <w:r>
+        <w:rPr>
+          <w:rFonts w:ascii="Consolas" w:eastAsia="Times New Roman" w:hAnsi="Consolas" w:cs="Times New Roman"/>
+          <w:color w:val="1F2328"/>
+          <w:kern w:val="0"/>
+          <w:sz w:val="21"/>
+          <w:szCs w:val="21"/>
+          <w14:ligatures w14:val="none"/>
+        </w:rPr>
+        <w:t>id,</w:t>
       </w:r>
     </w:p>
     <w:p>
@@ -2927,6 +3068,7 @@
         </w:rPr>
         <w:t xml:space="preserve"> </w:t>
       </w:r>
+      <w:proofErr w:type="gramStart"/>
       <w:r>
         <w:rPr>
           <w:rFonts w:ascii="Consolas" w:eastAsia="Times New Roman" w:hAnsi="Consolas" w:cs="Times New Roman"/>
@@ -2947,7 +3089,19 @@
           <w:szCs w:val="21"/>
           <w14:ligatures w14:val="none"/>
         </w:rPr>
-        <w:t>(),</w:t>
+        <w:t>(</w:t>
+      </w:r>
+      <w:proofErr w:type="gramEnd"/>
+      <w:r>
+        <w:rPr>
+          <w:rFonts w:ascii="Consolas" w:eastAsia="Times New Roman" w:hAnsi="Consolas" w:cs="Times New Roman"/>
+          <w:color w:val="1F2328"/>
+          <w:kern w:val="0"/>
+          <w:sz w:val="21"/>
+          <w:szCs w:val="21"/>
+          <w14:ligatures w14:val="none"/>
+        </w:rPr>
+        <w:t>),</w:t>
       </w:r>
     </w:p>
     <w:p>
@@ -3046,6 +3200,7 @@
         </w:rPr>
         <w:t xml:space="preserve">            </w:t>
       </w:r>
+      <w:proofErr w:type="gramStart"/>
       <w:r>
         <w:rPr>
           <w:rFonts w:ascii="Consolas" w:eastAsia="Times New Roman" w:hAnsi="Consolas" w:cs="Times New Roman"/>
@@ -3090,6 +3245,7 @@
         </w:rPr>
         <w:t>(</w:t>
       </w:r>
+      <w:proofErr w:type="gramEnd"/>
       <w:r>
         <w:rPr>
           <w:rFonts w:ascii="Consolas" w:eastAsia="Times New Roman" w:hAnsi="Consolas" w:cs="Times New Roman"/>
@@ -3137,6 +3293,7 @@
         </w:rPr>
         <w:t xml:space="preserve">            </w:t>
       </w:r>
+      <w:proofErr w:type="gramStart"/>
       <w:r>
         <w:rPr>
           <w:rFonts w:ascii="Consolas" w:eastAsia="Times New Roman" w:hAnsi="Consolas" w:cs="Times New Roman"/>
@@ -3181,6 +3338,7 @@
         </w:rPr>
         <w:t>(</w:t>
       </w:r>
+      <w:proofErr w:type="gramEnd"/>
       <w:r>
         <w:rPr>
           <w:rFonts w:ascii="Consolas" w:eastAsia="Times New Roman" w:hAnsi="Consolas" w:cs="Times New Roman"/>
@@ -3228,6 +3386,7 @@
         </w:rPr>
         <w:t xml:space="preserve">            </w:t>
       </w:r>
+      <w:proofErr w:type="gramStart"/>
       <w:r>
         <w:rPr>
           <w:rFonts w:ascii="Consolas" w:eastAsia="Times New Roman" w:hAnsi="Consolas" w:cs="Times New Roman"/>
@@ -3272,6 +3431,7 @@
         </w:rPr>
         <w:t>(</w:t>
       </w:r>
+      <w:proofErr w:type="gramEnd"/>
       <w:r>
         <w:rPr>
           <w:rFonts w:ascii="Consolas" w:eastAsia="Times New Roman" w:hAnsi="Consolas" w:cs="Times New Roman"/>
@@ -3370,7 +3530,7 @@
         <w:shd w:val="clear" w:color="auto" w:fill="FFFFFF"/>
         <w:spacing w:after="0" w:line="285" w:lineRule="atLeast"/>
         <w:rPr>
-          <w:rFonts w:ascii="Sakkal Majalla" w:eastAsia="Times New Roman" w:hAnsi="Sakkal Majalla" w:cs="Sakkal Majalla" w:hint="cs"/>
+          <w:rFonts w:ascii="Sakkal Majalla" w:eastAsia="Times New Roman" w:hAnsi="Sakkal Majalla" w:cs="Sakkal Majalla"/>
           <w:color w:val="202020"/>
           <w:kern w:val="0"/>
           <w14:ligatures w14:val="none"/>
@@ -3408,7 +3568,55 @@
           <w:szCs w:val="21"/>
           <w14:ligatures w14:val="none"/>
         </w:rPr>
-        <w:t>// console.log("The Connected Sockets are: ", Object.keys(io.sockets.sockets));</w:t>
+        <w:t xml:space="preserve">// </w:t>
+      </w:r>
+      <w:proofErr w:type="gramStart"/>
+      <w:r>
+        <w:rPr>
+          <w:rFonts w:ascii="Consolas" w:eastAsia="Times New Roman" w:hAnsi="Consolas" w:cs="Times New Roman"/>
+          <w:color w:val="6E7781"/>
+          <w:kern w:val="0"/>
+          <w:sz w:val="21"/>
+          <w:szCs w:val="21"/>
+          <w14:ligatures w14:val="none"/>
+        </w:rPr>
+        <w:t>console.log(</w:t>
+      </w:r>
+      <w:proofErr w:type="gramEnd"/>
+      <w:r>
+        <w:rPr>
+          <w:rFonts w:ascii="Consolas" w:eastAsia="Times New Roman" w:hAnsi="Consolas" w:cs="Times New Roman"/>
+          <w:color w:val="6E7781"/>
+          <w:kern w:val="0"/>
+          <w:sz w:val="21"/>
+          <w:szCs w:val="21"/>
+          <w14:ligatures w14:val="none"/>
+        </w:rPr>
+        <w:t>"The Connected Sockets are: ", Object.keys(</w:t>
+      </w:r>
+      <w:proofErr w:type="gramStart"/>
+      <w:r>
+        <w:rPr>
+          <w:rFonts w:ascii="Consolas" w:eastAsia="Times New Roman" w:hAnsi="Consolas" w:cs="Times New Roman"/>
+          <w:color w:val="6E7781"/>
+          <w:kern w:val="0"/>
+          <w:sz w:val="21"/>
+          <w:szCs w:val="21"/>
+          <w14:ligatures w14:val="none"/>
+        </w:rPr>
+        <w:t>io.sockets</w:t>
+      </w:r>
+      <w:proofErr w:type="gramEnd"/>
+      <w:r>
+        <w:rPr>
+          <w:rFonts w:ascii="Consolas" w:eastAsia="Times New Roman" w:hAnsi="Consolas" w:cs="Times New Roman"/>
+          <w:color w:val="6E7781"/>
+          <w:kern w:val="0"/>
+          <w:sz w:val="21"/>
+          <w:szCs w:val="21"/>
+          <w14:ligatures w14:val="none"/>
+        </w:rPr>
+        <w:t>.sockets));</w:t>
       </w:r>
     </w:p>
     <w:p>
@@ -3424,6 +3632,7 @@
           <w14:ligatures w14:val="none"/>
         </w:rPr>
       </w:pPr>
+      <w:proofErr w:type="gramStart"/>
       <w:r>
         <w:rPr>
           <w:rFonts w:ascii="Consolas" w:eastAsia="Times New Roman" w:hAnsi="Consolas" w:cs="Times New Roman"/>
@@ -3457,6 +3666,7 @@
         </w:rPr>
         <w:t>on</w:t>
       </w:r>
+      <w:proofErr w:type="gramEnd"/>
       <w:r>
         <w:rPr>
           <w:rFonts w:ascii="Consolas" w:eastAsia="Times New Roman" w:hAnsi="Consolas" w:cs="Times New Roman"/>
@@ -3625,6 +3835,7 @@
         </w:rPr>
         <w:t xml:space="preserve"> </w:t>
       </w:r>
+      <w:proofErr w:type="gramStart"/>
       <w:r>
         <w:rPr>
           <w:rFonts w:ascii="Consolas" w:eastAsia="Times New Roman" w:hAnsi="Consolas" w:cs="Times New Roman"/>
@@ -3658,6 +3869,7 @@
         </w:rPr>
         <w:t>!=</w:t>
       </w:r>
+      <w:proofErr w:type="gramEnd"/>
       <w:r>
         <w:rPr>
           <w:rFonts w:ascii="Consolas" w:eastAsia="Times New Roman" w:hAnsi="Consolas" w:cs="Times New Roman"/>
@@ -3730,6 +3942,7 @@
         </w:rPr>
         <w:t xml:space="preserve">        </w:t>
       </w:r>
+      <w:proofErr w:type="gramStart"/>
       <w:r>
         <w:rPr>
           <w:rFonts w:ascii="Consolas" w:eastAsia="Times New Roman" w:hAnsi="Consolas" w:cs="Times New Roman"/>
@@ -3763,6 +3976,7 @@
         </w:rPr>
         <w:t>emit</w:t>
       </w:r>
+      <w:proofErr w:type="gramEnd"/>
       <w:r>
         <w:rPr>
           <w:rFonts w:ascii="Consolas" w:eastAsia="Times New Roman" w:hAnsi="Consolas" w:cs="Times New Roman"/>
@@ -3847,33 +4061,3599 @@
         <w:shd w:val="clear" w:color="auto" w:fill="FFFFFF"/>
         <w:spacing w:after="0" w:line="285" w:lineRule="atLeast"/>
         <w:rPr>
-          <w:rFonts w:ascii="Consolas" w:eastAsia="Times New Roman" w:hAnsi="Consolas" w:cs="Times New Roman"/>
-          <w:color w:val="202020"/>
-          <w:kern w:val="0"/>
-          <w:sz w:val="21"/>
-          <w:szCs w:val="21"/>
-          <w14:ligatures w14:val="none"/>
-        </w:rPr>
-      </w:pPr>
+          <w:rFonts w:ascii="Sakkal Majalla" w:eastAsia="Times New Roman" w:hAnsi="Sakkal Majalla" w:cs="Sakkal Majalla" w:hint="cs"/>
+          <w:color w:val="202020"/>
+          <w:kern w:val="0"/>
+          <w:sz w:val="28"/>
+          <w:szCs w:val="28"/>
+          <w14:ligatures w14:val="none"/>
+        </w:rPr>
+      </w:pPr>
+      <w:r>
+        <w:rPr>
+          <w:rFonts w:ascii="Sakkal Majalla" w:eastAsia="Times New Roman" w:hAnsi="Sakkal Majalla" w:cs="Sakkal Majalla" w:hint="cs"/>
+          <w:color w:val="202020"/>
+          <w:kern w:val="0"/>
+          <w:sz w:val="28"/>
+          <w:szCs w:val="28"/>
+          <w14:ligatures w14:val="none"/>
+        </w:rPr>
+        <w:t>To use Socket.IO with React applications</w:t>
+      </w:r>
+      <w:r>
+        <w:rPr>
+          <w:rFonts w:ascii="Sakkal Majalla" w:eastAsia="Times New Roman" w:hAnsi="Sakkal Majalla" w:cs="Sakkal Majalla"/>
+          <w:color w:val="202020"/>
+          <w:kern w:val="0"/>
+          <w:sz w:val="28"/>
+          <w:szCs w:val="28"/>
+          <w14:ligatures w14:val="none"/>
+        </w:rPr>
+        <w:t>,</w:t>
+      </w:r>
+      <w:r>
+        <w:rPr>
+          <w:rFonts w:ascii="Sakkal Majalla" w:eastAsia="Times New Roman" w:hAnsi="Sakkal Majalla" w:cs="Sakkal Majalla" w:hint="cs"/>
+          <w:color w:val="202020"/>
+          <w:kern w:val="0"/>
+          <w:sz w:val="28"/>
+          <w:szCs w:val="28"/>
+          <w14:ligatures w14:val="none"/>
+        </w:rPr>
+        <w:t xml:space="preserve"> we can use:</w:t>
+      </w:r>
     </w:p>
     <w:p>
       <w:pPr>
         <w:shd w:val="clear" w:color="auto" w:fill="FFFFFF"/>
         <w:spacing w:after="0" w:line="285" w:lineRule="atLeast"/>
         <w:rPr>
+          <w:rFonts w:ascii="Consolas" w:eastAsia="Times New Roman" w:hAnsi="Consolas" w:cs="Times New Roman"/>
+          <w:color w:val="202020"/>
+          <w:kern w:val="0"/>
+          <w:sz w:val="21"/>
+          <w:szCs w:val="21"/>
+          <w14:ligatures w14:val="none"/>
+        </w:rPr>
+      </w:pPr>
+      <w:r>
+        <w:rPr>
+          <w:rFonts w:ascii="Consolas" w:eastAsia="Times New Roman" w:hAnsi="Consolas" w:cs="Times New Roman"/>
+          <w:color w:val="AF00DB"/>
+          <w:kern w:val="0"/>
+          <w:sz w:val="21"/>
+          <w:szCs w:val="21"/>
+          <w14:ligatures w14:val="none"/>
+        </w:rPr>
+        <w:t>import</w:t>
+      </w:r>
+      <w:r>
+        <w:rPr>
+          <w:rFonts w:ascii="Consolas" w:eastAsia="Times New Roman" w:hAnsi="Consolas" w:cs="Times New Roman"/>
+          <w:color w:val="202020"/>
+          <w:kern w:val="0"/>
+          <w:sz w:val="21"/>
+          <w:szCs w:val="21"/>
+          <w14:ligatures w14:val="none"/>
+        </w:rPr>
+        <w:t xml:space="preserve"> </w:t>
+      </w:r>
+      <w:proofErr w:type="gramStart"/>
+      <w:r>
+        <w:rPr>
+          <w:rFonts w:ascii="Consolas" w:eastAsia="Times New Roman" w:hAnsi="Consolas" w:cs="Times New Roman"/>
+          <w:color w:val="1F2328"/>
+          <w:kern w:val="0"/>
+          <w:sz w:val="21"/>
+          <w:szCs w:val="21"/>
+          <w14:ligatures w14:val="none"/>
+        </w:rPr>
+        <w:t>{ Socket</w:t>
+      </w:r>
+      <w:proofErr w:type="gramEnd"/>
+      <w:r>
+        <w:rPr>
+          <w:rFonts w:ascii="Consolas" w:eastAsia="Times New Roman" w:hAnsi="Consolas" w:cs="Times New Roman"/>
+          <w:color w:val="1F2328"/>
+          <w:kern w:val="0"/>
+          <w:sz w:val="21"/>
+          <w:szCs w:val="21"/>
+          <w14:ligatures w14:val="none"/>
+        </w:rPr>
+        <w:t xml:space="preserve">, </w:t>
+      </w:r>
+      <w:proofErr w:type="gramStart"/>
+      <w:r>
+        <w:rPr>
+          <w:rFonts w:ascii="Consolas" w:eastAsia="Times New Roman" w:hAnsi="Consolas" w:cs="Times New Roman"/>
+          <w:color w:val="1F2328"/>
+          <w:kern w:val="0"/>
+          <w:sz w:val="21"/>
+          <w:szCs w:val="21"/>
+          <w14:ligatures w14:val="none"/>
+        </w:rPr>
+        <w:t>io }</w:t>
+      </w:r>
+      <w:proofErr w:type="gramEnd"/>
+      <w:r>
+        <w:rPr>
+          <w:rFonts w:ascii="Consolas" w:eastAsia="Times New Roman" w:hAnsi="Consolas" w:cs="Times New Roman"/>
+          <w:color w:val="202020"/>
+          <w:kern w:val="0"/>
+          <w:sz w:val="21"/>
+          <w:szCs w:val="21"/>
+          <w14:ligatures w14:val="none"/>
+        </w:rPr>
+        <w:t xml:space="preserve"> </w:t>
+      </w:r>
+      <w:r>
+        <w:rPr>
+          <w:rFonts w:ascii="Consolas" w:eastAsia="Times New Roman" w:hAnsi="Consolas" w:cs="Times New Roman"/>
+          <w:color w:val="AF00DB"/>
+          <w:kern w:val="0"/>
+          <w:sz w:val="21"/>
+          <w:szCs w:val="21"/>
+          <w14:ligatures w14:val="none"/>
+        </w:rPr>
+        <w:t>from</w:t>
+      </w:r>
+      <w:r>
+        <w:rPr>
+          <w:rFonts w:ascii="Consolas" w:eastAsia="Times New Roman" w:hAnsi="Consolas" w:cs="Times New Roman"/>
+          <w:color w:val="202020"/>
+          <w:kern w:val="0"/>
+          <w:sz w:val="21"/>
+          <w:szCs w:val="21"/>
+          <w14:ligatures w14:val="none"/>
+        </w:rPr>
+        <w:t xml:space="preserve"> </w:t>
+      </w:r>
+      <w:r>
+        <w:rPr>
+          <w:rFonts w:ascii="Consolas" w:eastAsia="Times New Roman" w:hAnsi="Consolas" w:cs="Times New Roman"/>
+          <w:color w:val="0A3069"/>
+          <w:kern w:val="0"/>
+          <w:sz w:val="21"/>
+          <w:szCs w:val="21"/>
+          <w14:ligatures w14:val="none"/>
+        </w:rPr>
+        <w:t>"socket.io-client"</w:t>
+      </w:r>
+      <w:r>
+        <w:rPr>
+          <w:rFonts w:ascii="Consolas" w:eastAsia="Times New Roman" w:hAnsi="Consolas" w:cs="Times New Roman"/>
+          <w:color w:val="202020"/>
+          <w:kern w:val="0"/>
+          <w:sz w:val="21"/>
+          <w:szCs w:val="21"/>
+          <w14:ligatures w14:val="none"/>
+        </w:rPr>
+        <w:t>;</w:t>
+      </w:r>
+    </w:p>
+    <w:p>
+      <w:pPr>
+        <w:ind w:left="1440" w:firstLine="720"/>
+        <w:rPr>
+          <w:rFonts w:ascii="Sakkal Majalla" w:eastAsia="Times New Roman" w:hAnsi="Sakkal Majalla" w:cs="Sakkal Majalla"/>
+          <w:color w:val="202020"/>
+          <w:kern w:val="0"/>
+          <w14:ligatures w14:val="none"/>
+        </w:rPr>
+      </w:pPr>
+      <w:r>
+        <w:rPr>
+          <w:rFonts w:ascii="Sakkal Majalla" w:eastAsia="Times New Roman" w:hAnsi="Sakkal Majalla" w:cs="Sakkal Majalla"/>
+          <w:color w:val="202020"/>
+          <w:kern w:val="0"/>
+          <w14:ligatures w14:val="none"/>
+        </w:rPr>
+        <w:t>======================================================</w:t>
+      </w:r>
+    </w:p>
+    <w:p>
+      <w:pPr>
+        <w:rPr>
+          <w:rFonts w:ascii="Sakkal Majalla" w:eastAsia="Times New Roman" w:hAnsi="Sakkal Majalla" w:cs="Sakkal Majalla"/>
+          <w:color w:val="202020"/>
+          <w:kern w:val="0"/>
+          <w14:ligatures w14:val="none"/>
+        </w:rPr>
+      </w:pPr>
+      <w:r>
+        <w:rPr>
+          <w:rFonts w:ascii="Sakkal Majalla" w:eastAsia="Times New Roman" w:hAnsi="Sakkal Majalla" w:cs="Sakkal Majalla"/>
+          <w:color w:val="202020"/>
+          <w:kern w:val="0"/>
+          <w14:ligatures w14:val="none"/>
+        </w:rPr>
+        <w:t xml:space="preserve">To use the socket-object in the </w:t>
+      </w:r>
+      <w:r>
+        <w:rPr>
+          <w:rFonts w:ascii="Sakkal Majalla" w:eastAsia="Times New Roman" w:hAnsi="Sakkal Majalla" w:cs="Sakkal Majalla"/>
+          <w:color w:val="202020"/>
+          <w:kern w:val="0"/>
+          <w14:ligatures w14:val="none"/>
+        </w:rPr>
+        <w:t>React application</w:t>
+      </w:r>
+      <w:r>
+        <w:rPr>
+          <w:rFonts w:ascii="Sakkal Majalla" w:eastAsia="Times New Roman" w:hAnsi="Sakkal Majalla" w:cs="Sakkal Majalla"/>
+          <w:color w:val="202020"/>
+          <w:kern w:val="0"/>
+          <w14:ligatures w14:val="none"/>
+        </w:rPr>
+        <w:t>:</w:t>
+      </w:r>
+    </w:p>
+    <w:p>
+      <w:pPr>
+        <w:shd w:val="clear" w:color="auto" w:fill="FFFFFF"/>
+        <w:spacing w:after="0" w:line="285" w:lineRule="atLeast"/>
+        <w:rPr>
+          <w:rFonts w:ascii="Consolas" w:eastAsia="Times New Roman" w:hAnsi="Consolas" w:cs="Times New Roman"/>
+          <w:color w:val="202020"/>
+          <w:kern w:val="0"/>
+          <w:sz w:val="21"/>
+          <w:szCs w:val="21"/>
+          <w14:ligatures w14:val="none"/>
+        </w:rPr>
+      </w:pPr>
+      <w:r>
+        <w:rPr>
+          <w:rFonts w:ascii="Consolas" w:eastAsia="Times New Roman" w:hAnsi="Consolas" w:cs="Times New Roman"/>
+          <w:color w:val="CF222E"/>
+          <w:kern w:val="0"/>
+          <w:sz w:val="21"/>
+          <w:szCs w:val="21"/>
+          <w14:ligatures w14:val="none"/>
+        </w:rPr>
+        <w:t>const</w:t>
+      </w:r>
+      <w:r>
+        <w:rPr>
+          <w:rFonts w:ascii="Consolas" w:eastAsia="Times New Roman" w:hAnsi="Consolas" w:cs="Times New Roman"/>
+          <w:color w:val="1F2328"/>
+          <w:kern w:val="0"/>
+          <w:sz w:val="21"/>
+          <w:szCs w:val="21"/>
+          <w14:ligatures w14:val="none"/>
+        </w:rPr>
+        <w:t xml:space="preserve"> [</w:t>
+      </w:r>
+      <w:r>
+        <w:rPr>
+          <w:rFonts w:ascii="Consolas" w:eastAsia="Times New Roman" w:hAnsi="Consolas" w:cs="Times New Roman"/>
+          <w:color w:val="0550AE"/>
+          <w:kern w:val="0"/>
+          <w:sz w:val="21"/>
+          <w:szCs w:val="21"/>
+          <w14:ligatures w14:val="none"/>
+        </w:rPr>
+        <w:t>socket</w:t>
+      </w:r>
+      <w:r>
+        <w:rPr>
+          <w:rFonts w:ascii="Consolas" w:eastAsia="Times New Roman" w:hAnsi="Consolas" w:cs="Times New Roman"/>
+          <w:color w:val="1F2328"/>
+          <w:kern w:val="0"/>
+          <w:sz w:val="21"/>
+          <w:szCs w:val="21"/>
+          <w14:ligatures w14:val="none"/>
+        </w:rPr>
+        <w:t xml:space="preserve">, </w:t>
+      </w:r>
+      <w:r>
+        <w:rPr>
+          <w:rFonts w:ascii="Consolas" w:eastAsia="Times New Roman" w:hAnsi="Consolas" w:cs="Times New Roman"/>
+          <w:color w:val="0550AE"/>
+          <w:kern w:val="0"/>
+          <w:sz w:val="21"/>
+          <w:szCs w:val="21"/>
+          <w14:ligatures w14:val="none"/>
+        </w:rPr>
+        <w:t>setSocket</w:t>
+      </w:r>
+      <w:r>
+        <w:rPr>
+          <w:rFonts w:ascii="Consolas" w:eastAsia="Times New Roman" w:hAnsi="Consolas" w:cs="Times New Roman"/>
+          <w:color w:val="1F2328"/>
+          <w:kern w:val="0"/>
+          <w:sz w:val="21"/>
+          <w:szCs w:val="21"/>
+          <w14:ligatures w14:val="none"/>
+        </w:rPr>
+        <w:t xml:space="preserve">] </w:t>
+      </w:r>
+      <w:r>
+        <w:rPr>
+          <w:rFonts w:ascii="Consolas" w:eastAsia="Times New Roman" w:hAnsi="Consolas" w:cs="Times New Roman"/>
+          <w:color w:val="000000"/>
+          <w:kern w:val="0"/>
+          <w:sz w:val="21"/>
+          <w:szCs w:val="21"/>
+          <w14:ligatures w14:val="none"/>
+        </w:rPr>
+        <w:t>=</w:t>
+      </w:r>
+      <w:r>
+        <w:rPr>
+          <w:rFonts w:ascii="Consolas" w:eastAsia="Times New Roman" w:hAnsi="Consolas" w:cs="Times New Roman"/>
+          <w:color w:val="1F2328"/>
+          <w:kern w:val="0"/>
+          <w:sz w:val="21"/>
+          <w:szCs w:val="21"/>
+          <w14:ligatures w14:val="none"/>
+        </w:rPr>
+        <w:t xml:space="preserve"> </w:t>
+      </w:r>
+      <w:r>
+        <w:rPr>
+          <w:rFonts w:ascii="Consolas" w:eastAsia="Times New Roman" w:hAnsi="Consolas" w:cs="Times New Roman"/>
+          <w:color w:val="8250DF"/>
+          <w:kern w:val="0"/>
+          <w:sz w:val="21"/>
+          <w:szCs w:val="21"/>
+          <w14:ligatures w14:val="none"/>
+        </w:rPr>
+        <w:t>useState</w:t>
+      </w:r>
+      <w:r>
+        <w:rPr>
+          <w:rFonts w:ascii="Consolas" w:eastAsia="Times New Roman" w:hAnsi="Consolas" w:cs="Times New Roman"/>
+          <w:color w:val="1F2328"/>
+          <w:kern w:val="0"/>
+          <w:sz w:val="21"/>
+          <w:szCs w:val="21"/>
+          <w14:ligatures w14:val="none"/>
+        </w:rPr>
+        <w:t>&lt;</w:t>
+      </w:r>
+      <w:r>
+        <w:rPr>
+          <w:rFonts w:ascii="Consolas" w:eastAsia="Times New Roman" w:hAnsi="Consolas" w:cs="Times New Roman"/>
+          <w:color w:val="267F99"/>
+          <w:kern w:val="0"/>
+          <w:sz w:val="21"/>
+          <w:szCs w:val="21"/>
+          <w14:ligatures w14:val="none"/>
+        </w:rPr>
+        <w:t>Socket</w:t>
+      </w:r>
+      <w:proofErr w:type="gramStart"/>
+      <w:r>
+        <w:rPr>
+          <w:rFonts w:ascii="Consolas" w:eastAsia="Times New Roman" w:hAnsi="Consolas" w:cs="Times New Roman"/>
+          <w:color w:val="1F2328"/>
+          <w:kern w:val="0"/>
+          <w:sz w:val="21"/>
+          <w:szCs w:val="21"/>
+          <w14:ligatures w14:val="none"/>
+        </w:rPr>
+        <w:t>&gt;(</w:t>
+      </w:r>
+      <w:proofErr w:type="gramEnd"/>
+      <w:r>
+        <w:rPr>
+          <w:rFonts w:ascii="Consolas" w:eastAsia="Times New Roman" w:hAnsi="Consolas" w:cs="Times New Roman"/>
+          <w:color w:val="1F2328"/>
+          <w:kern w:val="0"/>
+          <w:sz w:val="21"/>
+          <w:szCs w:val="21"/>
+          <w14:ligatures w14:val="none"/>
+        </w:rPr>
+        <w:t>);</w:t>
+      </w:r>
+    </w:p>
+    <w:p>
+      <w:pPr>
+        <w:ind w:left="1440" w:firstLine="720"/>
+        <w:rPr>
+          <w:rFonts w:ascii="Sakkal Majalla" w:eastAsia="Times New Roman" w:hAnsi="Sakkal Majalla" w:cs="Sakkal Majalla"/>
+          <w:color w:val="202020"/>
+          <w:kern w:val="0"/>
+          <w14:ligatures w14:val="none"/>
+        </w:rPr>
+      </w:pPr>
+      <w:r>
+        <w:rPr>
+          <w:rFonts w:ascii="Sakkal Majalla" w:eastAsia="Times New Roman" w:hAnsi="Sakkal Majalla" w:cs="Sakkal Majalla"/>
+          <w:color w:val="202020"/>
+          <w:kern w:val="0"/>
+          <w14:ligatures w14:val="none"/>
+        </w:rPr>
+        <w:t>======================================================</w:t>
+      </w:r>
+    </w:p>
+    <w:p>
+      <w:pPr>
+        <w:rPr>
+          <w:rFonts w:ascii="Sakkal Majalla" w:eastAsia="Times New Roman" w:hAnsi="Sakkal Majalla" w:cs="Sakkal Majalla"/>
+          <w:color w:val="202020"/>
+          <w:kern w:val="0"/>
+          <w14:ligatures w14:val="none"/>
+        </w:rPr>
+      </w:pPr>
+    </w:p>
+    <w:p>
+      <w:pPr>
+        <w:ind w:left="1440" w:firstLine="720"/>
+        <w:rPr>
+          <w:rFonts w:ascii="Sakkal Majalla" w:eastAsia="Times New Roman" w:hAnsi="Sakkal Majalla" w:cs="Sakkal Majalla"/>
+          <w:color w:val="202020"/>
+          <w:kern w:val="0"/>
+          <w14:ligatures w14:val="none"/>
+        </w:rPr>
+      </w:pPr>
+    </w:p>
+    <w:p>
+      <w:pPr>
+        <w:ind w:left="1440" w:firstLine="720"/>
+        <w:rPr>
+          <w:rFonts w:ascii="Sakkal Majalla" w:eastAsia="Times New Roman" w:hAnsi="Sakkal Majalla" w:cs="Sakkal Majalla"/>
+          <w:color w:val="202020"/>
+          <w:kern w:val="0"/>
+          <w14:ligatures w14:val="none"/>
+        </w:rPr>
+      </w:pPr>
+    </w:p>
+    <w:p>
+      <w:pPr>
+        <w:ind w:left="1440" w:firstLine="720"/>
+        <w:rPr>
+          <w:rFonts w:ascii="Sakkal Majalla" w:eastAsia="Times New Roman" w:hAnsi="Sakkal Majalla" w:cs="Sakkal Majalla"/>
+          <w:color w:val="202020"/>
+          <w:kern w:val="0"/>
+          <w14:ligatures w14:val="none"/>
+        </w:rPr>
+      </w:pPr>
+    </w:p>
+    <w:p>
+      <w:pPr>
+        <w:ind w:left="1440" w:firstLine="720"/>
+        <w:rPr>
+          <w:rFonts w:ascii="Sakkal Majalla" w:eastAsia="Times New Roman" w:hAnsi="Sakkal Majalla" w:cs="Sakkal Majalla"/>
+          <w:color w:val="202020"/>
+          <w:kern w:val="0"/>
+          <w14:ligatures w14:val="none"/>
+        </w:rPr>
+      </w:pPr>
+    </w:p>
+    <w:p>
+      <w:pPr>
+        <w:rPr>
+          <w:rFonts w:ascii="Sakkal Majalla" w:eastAsia="Times New Roman" w:hAnsi="Sakkal Majalla" w:cs="Sakkal Majalla"/>
+          <w:color w:val="202020"/>
+          <w:kern w:val="0"/>
+          <w14:ligatures w14:val="none"/>
+        </w:rPr>
+      </w:pPr>
+    </w:p>
+    <w:p>
+      <w:pPr>
+        <w:rPr>
+          <w:rFonts w:ascii="Sakkal Majalla" w:hAnsi="Sakkal Majalla" w:cs="Sakkal Majalla"/>
+        </w:rPr>
+      </w:pPr>
+      <w:r>
+        <w:rPr>
+          <w:rFonts w:ascii="Sakkal Majalla" w:hAnsi="Sakkal Majalla" w:cs="Sakkal Majalla"/>
+        </w:rPr>
+        <w:lastRenderedPageBreak/>
+        <w:t>To use the socket in React state management:</w:t>
+      </w:r>
+    </w:p>
+    <w:p>
+      <w:pPr>
+        <w:shd w:val="clear" w:color="auto" w:fill="FFFFFF"/>
+        <w:spacing w:after="0" w:line="285" w:lineRule="atLeast"/>
+        <w:rPr>
+          <w:rFonts w:ascii="Consolas" w:eastAsia="Times New Roman" w:hAnsi="Consolas" w:cs="Times New Roman"/>
+          <w:color w:val="202020"/>
+          <w:kern w:val="0"/>
+          <w:sz w:val="21"/>
+          <w:szCs w:val="21"/>
+          <w14:ligatures w14:val="none"/>
+        </w:rPr>
+      </w:pPr>
+      <w:proofErr w:type="gramStart"/>
+      <w:r>
+        <w:rPr>
+          <w:rFonts w:ascii="Consolas" w:eastAsia="Times New Roman" w:hAnsi="Consolas" w:cs="Times New Roman"/>
+          <w:color w:val="8250DF"/>
+          <w:kern w:val="0"/>
+          <w:sz w:val="21"/>
+          <w:szCs w:val="21"/>
+          <w14:ligatures w14:val="none"/>
+        </w:rPr>
+        <w:t>useEffect</w:t>
+      </w:r>
+      <w:r>
+        <w:rPr>
+          <w:rFonts w:ascii="Consolas" w:eastAsia="Times New Roman" w:hAnsi="Consolas" w:cs="Times New Roman"/>
+          <w:color w:val="1F2328"/>
+          <w:kern w:val="0"/>
+          <w:sz w:val="21"/>
+          <w:szCs w:val="21"/>
+          <w14:ligatures w14:val="none"/>
+        </w:rPr>
+        <w:t>(</w:t>
+      </w:r>
+      <w:proofErr w:type="gramEnd"/>
+      <w:r>
+        <w:rPr>
+          <w:rFonts w:ascii="Consolas" w:eastAsia="Times New Roman" w:hAnsi="Consolas" w:cs="Times New Roman"/>
+          <w:color w:val="1F2328"/>
+          <w:kern w:val="0"/>
+          <w:sz w:val="21"/>
+          <w:szCs w:val="21"/>
+          <w14:ligatures w14:val="none"/>
+        </w:rPr>
+        <w:t xml:space="preserve">() </w:t>
+      </w:r>
+      <w:r>
+        <w:rPr>
+          <w:rFonts w:ascii="Consolas" w:eastAsia="Times New Roman" w:hAnsi="Consolas" w:cs="Times New Roman"/>
+          <w:color w:val="CF222E"/>
+          <w:kern w:val="0"/>
+          <w:sz w:val="21"/>
+          <w:szCs w:val="21"/>
+          <w14:ligatures w14:val="none"/>
+        </w:rPr>
+        <w:t>=&gt;</w:t>
+      </w:r>
+      <w:r>
+        <w:rPr>
+          <w:rFonts w:ascii="Consolas" w:eastAsia="Times New Roman" w:hAnsi="Consolas" w:cs="Times New Roman"/>
+          <w:color w:val="1F2328"/>
+          <w:kern w:val="0"/>
+          <w:sz w:val="21"/>
+          <w:szCs w:val="21"/>
+          <w14:ligatures w14:val="none"/>
+        </w:rPr>
+        <w:t xml:space="preserve"> {</w:t>
+      </w:r>
+    </w:p>
+    <w:p>
+      <w:pPr>
+        <w:shd w:val="clear" w:color="auto" w:fill="FFFFFF"/>
+        <w:spacing w:after="0" w:line="285" w:lineRule="atLeast"/>
+        <w:rPr>
+          <w:rFonts w:ascii="Consolas" w:eastAsia="Times New Roman" w:hAnsi="Consolas" w:cs="Times New Roman"/>
+          <w:color w:val="202020"/>
+          <w:kern w:val="0"/>
+          <w:sz w:val="21"/>
+          <w:szCs w:val="21"/>
+          <w14:ligatures w14:val="none"/>
+        </w:rPr>
+      </w:pPr>
+      <w:r>
+        <w:rPr>
+          <w:rFonts w:ascii="Consolas" w:eastAsia="Times New Roman" w:hAnsi="Consolas" w:cs="Times New Roman"/>
+          <w:color w:val="1F2328"/>
+          <w:kern w:val="0"/>
+          <w:sz w:val="21"/>
+          <w:szCs w:val="21"/>
+          <w14:ligatures w14:val="none"/>
+        </w:rPr>
+        <w:t xml:space="preserve">        </w:t>
+      </w:r>
+      <w:r>
+        <w:rPr>
+          <w:rFonts w:ascii="Consolas" w:eastAsia="Times New Roman" w:hAnsi="Consolas" w:cs="Times New Roman"/>
+          <w:color w:val="CF222E"/>
+          <w:kern w:val="0"/>
+          <w:sz w:val="21"/>
+          <w:szCs w:val="21"/>
+          <w14:ligatures w14:val="none"/>
+        </w:rPr>
+        <w:t>let</w:t>
+      </w:r>
+      <w:r>
+        <w:rPr>
+          <w:rFonts w:ascii="Consolas" w:eastAsia="Times New Roman" w:hAnsi="Consolas" w:cs="Times New Roman"/>
+          <w:color w:val="1F2328"/>
+          <w:kern w:val="0"/>
+          <w:sz w:val="21"/>
+          <w:szCs w:val="21"/>
+          <w14:ligatures w14:val="none"/>
+        </w:rPr>
+        <w:t xml:space="preserve"> newSocket </w:t>
+      </w:r>
+      <w:r>
+        <w:rPr>
+          <w:rFonts w:ascii="Consolas" w:eastAsia="Times New Roman" w:hAnsi="Consolas" w:cs="Times New Roman"/>
+          <w:color w:val="000000"/>
+          <w:kern w:val="0"/>
+          <w:sz w:val="21"/>
+          <w:szCs w:val="21"/>
+          <w14:ligatures w14:val="none"/>
+        </w:rPr>
+        <w:t>=</w:t>
+      </w:r>
+      <w:r>
+        <w:rPr>
+          <w:rFonts w:ascii="Consolas" w:eastAsia="Times New Roman" w:hAnsi="Consolas" w:cs="Times New Roman"/>
+          <w:color w:val="1F2328"/>
+          <w:kern w:val="0"/>
+          <w:sz w:val="21"/>
+          <w:szCs w:val="21"/>
+          <w14:ligatures w14:val="none"/>
+        </w:rPr>
+        <w:t xml:space="preserve"> </w:t>
+      </w:r>
+      <w:r>
+        <w:rPr>
+          <w:rFonts w:ascii="Consolas" w:eastAsia="Times New Roman" w:hAnsi="Consolas" w:cs="Times New Roman"/>
+          <w:color w:val="8250DF"/>
+          <w:kern w:val="0"/>
+          <w:sz w:val="21"/>
+          <w:szCs w:val="21"/>
+          <w14:ligatures w14:val="none"/>
+        </w:rPr>
+        <w:t>io</w:t>
+      </w:r>
+      <w:r>
+        <w:rPr>
+          <w:rFonts w:ascii="Consolas" w:eastAsia="Times New Roman" w:hAnsi="Consolas" w:cs="Times New Roman"/>
+          <w:color w:val="1F2328"/>
+          <w:kern w:val="0"/>
+          <w:sz w:val="21"/>
+          <w:szCs w:val="21"/>
+          <w14:ligatures w14:val="none"/>
+        </w:rPr>
+        <w:t>(</w:t>
+      </w:r>
+      <w:r>
+        <w:rPr>
+          <w:rFonts w:ascii="Consolas" w:eastAsia="Times New Roman" w:hAnsi="Consolas" w:cs="Times New Roman"/>
+          <w:color w:val="0A3069"/>
+          <w:kern w:val="0"/>
+          <w:sz w:val="21"/>
+          <w:szCs w:val="21"/>
+          <w14:ligatures w14:val="none"/>
+        </w:rPr>
+        <w:t>"http://localhost:3000"</w:t>
+      </w:r>
+      <w:r>
+        <w:rPr>
+          <w:rFonts w:ascii="Consolas" w:eastAsia="Times New Roman" w:hAnsi="Consolas" w:cs="Times New Roman"/>
+          <w:color w:val="1F2328"/>
+          <w:kern w:val="0"/>
+          <w:sz w:val="21"/>
+          <w:szCs w:val="21"/>
+          <w14:ligatures w14:val="none"/>
+        </w:rPr>
+        <w:t>);</w:t>
+      </w:r>
+    </w:p>
+    <w:p>
+      <w:pPr>
+        <w:shd w:val="clear" w:color="auto" w:fill="FFFFFF"/>
+        <w:spacing w:after="0" w:line="285" w:lineRule="atLeast"/>
+        <w:rPr>
+          <w:rFonts w:ascii="Consolas" w:eastAsia="Times New Roman" w:hAnsi="Consolas" w:cs="Times New Roman"/>
+          <w:color w:val="202020"/>
+          <w:kern w:val="0"/>
+          <w:sz w:val="21"/>
+          <w:szCs w:val="21"/>
+          <w14:ligatures w14:val="none"/>
+        </w:rPr>
+      </w:pPr>
+      <w:r>
+        <w:rPr>
+          <w:rFonts w:ascii="Consolas" w:eastAsia="Times New Roman" w:hAnsi="Consolas" w:cs="Times New Roman"/>
+          <w:color w:val="1F2328"/>
+          <w:kern w:val="0"/>
+          <w:sz w:val="21"/>
+          <w:szCs w:val="21"/>
+          <w14:ligatures w14:val="none"/>
+        </w:rPr>
+        <w:t xml:space="preserve">        </w:t>
+      </w:r>
+      <w:r>
+        <w:rPr>
+          <w:rFonts w:ascii="Consolas" w:eastAsia="Times New Roman" w:hAnsi="Consolas" w:cs="Times New Roman"/>
+          <w:color w:val="8250DF"/>
+          <w:kern w:val="0"/>
+          <w:sz w:val="21"/>
+          <w:szCs w:val="21"/>
+          <w14:ligatures w14:val="none"/>
+        </w:rPr>
+        <w:t>setSocket</w:t>
+      </w:r>
+      <w:r>
+        <w:rPr>
+          <w:rFonts w:ascii="Consolas" w:eastAsia="Times New Roman" w:hAnsi="Consolas" w:cs="Times New Roman"/>
+          <w:color w:val="1F2328"/>
+          <w:kern w:val="0"/>
+          <w:sz w:val="21"/>
+          <w:szCs w:val="21"/>
+          <w14:ligatures w14:val="none"/>
+        </w:rPr>
+        <w:t>(newSocket);</w:t>
+      </w:r>
+    </w:p>
+    <w:p>
+      <w:pPr>
+        <w:shd w:val="clear" w:color="auto" w:fill="FFFFFF"/>
+        <w:spacing w:after="0" w:line="285" w:lineRule="atLeast"/>
+        <w:rPr>
+          <w:rFonts w:ascii="Consolas" w:eastAsia="Times New Roman" w:hAnsi="Consolas" w:cs="Times New Roman"/>
+          <w:color w:val="1F2328"/>
+          <w:kern w:val="0"/>
+          <w:sz w:val="21"/>
+          <w:szCs w:val="21"/>
+          <w14:ligatures w14:val="none"/>
+        </w:rPr>
+      </w:pPr>
+      <w:r>
+        <w:rPr>
+          <w:rFonts w:ascii="Consolas" w:eastAsia="Times New Roman" w:hAnsi="Consolas" w:cs="Times New Roman"/>
+          <w:color w:val="1F2328"/>
+          <w:kern w:val="0"/>
+          <w:sz w:val="21"/>
+          <w:szCs w:val="21"/>
+          <w14:ligatures w14:val="none"/>
+        </w:rPr>
+        <w:t xml:space="preserve">        </w:t>
+      </w:r>
+    </w:p>
+    <w:p>
+      <w:pPr>
+        <w:shd w:val="clear" w:color="auto" w:fill="FFFFFF"/>
+        <w:spacing w:after="0" w:line="285" w:lineRule="atLeast"/>
+        <w:ind w:left="720"/>
+        <w:rPr>
+          <w:rFonts w:ascii="Consolas" w:eastAsia="Times New Roman" w:hAnsi="Consolas" w:cs="Times New Roman"/>
+          <w:color w:val="202020"/>
+          <w:kern w:val="0"/>
+          <w:sz w:val="21"/>
+          <w:szCs w:val="21"/>
+          <w14:ligatures w14:val="none"/>
+        </w:rPr>
+      </w:pPr>
+      <w:r>
+        <w:rPr>
+          <w:rFonts w:ascii="Consolas" w:eastAsia="Times New Roman" w:hAnsi="Consolas" w:cs="Times New Roman"/>
+          <w:color w:val="1F2328"/>
+          <w:kern w:val="0"/>
+          <w:sz w:val="21"/>
+          <w:szCs w:val="21"/>
+          <w14:ligatures w14:val="none"/>
+        </w:rPr>
+        <w:t xml:space="preserve">  </w:t>
+      </w:r>
+      <w:r>
+        <w:rPr>
+          <w:rFonts w:ascii="Consolas" w:eastAsia="Times New Roman" w:hAnsi="Consolas" w:cs="Times New Roman"/>
+          <w:color w:val="AF00DB"/>
+          <w:kern w:val="0"/>
+          <w:sz w:val="21"/>
+          <w:szCs w:val="21"/>
+          <w14:ligatures w14:val="none"/>
+        </w:rPr>
+        <w:t>return</w:t>
+      </w:r>
+      <w:r>
+        <w:rPr>
+          <w:rFonts w:ascii="Consolas" w:eastAsia="Times New Roman" w:hAnsi="Consolas" w:cs="Times New Roman"/>
+          <w:color w:val="1F2328"/>
+          <w:kern w:val="0"/>
+          <w:sz w:val="21"/>
+          <w:szCs w:val="21"/>
+          <w14:ligatures w14:val="none"/>
+        </w:rPr>
+        <w:t xml:space="preserve"> () </w:t>
+      </w:r>
+      <w:r>
+        <w:rPr>
+          <w:rFonts w:ascii="Consolas" w:eastAsia="Times New Roman" w:hAnsi="Consolas" w:cs="Times New Roman"/>
+          <w:color w:val="CF222E"/>
+          <w:kern w:val="0"/>
+          <w:sz w:val="21"/>
+          <w:szCs w:val="21"/>
+          <w14:ligatures w14:val="none"/>
+        </w:rPr>
+        <w:t>=&gt;</w:t>
+      </w:r>
+      <w:r>
+        <w:rPr>
+          <w:rFonts w:ascii="Consolas" w:eastAsia="Times New Roman" w:hAnsi="Consolas" w:cs="Times New Roman"/>
+          <w:color w:val="1F2328"/>
+          <w:kern w:val="0"/>
+          <w:sz w:val="21"/>
+          <w:szCs w:val="21"/>
+          <w14:ligatures w14:val="none"/>
+        </w:rPr>
+        <w:t xml:space="preserve"> {</w:t>
+      </w:r>
+    </w:p>
+    <w:p>
+      <w:pPr>
+        <w:shd w:val="clear" w:color="auto" w:fill="FFFFFF"/>
+        <w:spacing w:after="0" w:line="285" w:lineRule="atLeast"/>
+        <w:rPr>
+          <w:rFonts w:ascii="Consolas" w:eastAsia="Times New Roman" w:hAnsi="Consolas" w:cs="Times New Roman"/>
+          <w:color w:val="202020"/>
+          <w:kern w:val="0"/>
+          <w:sz w:val="21"/>
+          <w:szCs w:val="21"/>
+          <w14:ligatures w14:val="none"/>
+        </w:rPr>
+      </w:pPr>
+      <w:r>
+        <w:rPr>
+          <w:rFonts w:ascii="Consolas" w:eastAsia="Times New Roman" w:hAnsi="Consolas" w:cs="Times New Roman"/>
+          <w:color w:val="1F2328"/>
+          <w:kern w:val="0"/>
+          <w:sz w:val="21"/>
+          <w:szCs w:val="21"/>
+          <w14:ligatures w14:val="none"/>
+        </w:rPr>
+        <w:t xml:space="preserve">            </w:t>
+      </w:r>
+      <w:r>
+        <w:rPr>
+          <w:rFonts w:ascii="Consolas" w:eastAsia="Times New Roman" w:hAnsi="Consolas" w:cs="Times New Roman"/>
+          <w:color w:val="AF00DB"/>
+          <w:kern w:val="0"/>
+          <w:sz w:val="21"/>
+          <w:szCs w:val="21"/>
+          <w14:ligatures w14:val="none"/>
+        </w:rPr>
+        <w:t>if</w:t>
+      </w:r>
+      <w:r>
+        <w:rPr>
+          <w:rFonts w:ascii="Consolas" w:eastAsia="Times New Roman" w:hAnsi="Consolas" w:cs="Times New Roman"/>
+          <w:color w:val="1F2328"/>
+          <w:kern w:val="0"/>
+          <w:sz w:val="21"/>
+          <w:szCs w:val="21"/>
+          <w14:ligatures w14:val="none"/>
+        </w:rPr>
+        <w:t xml:space="preserve"> (</w:t>
+      </w:r>
+      <w:proofErr w:type="gramStart"/>
+      <w:r>
+        <w:rPr>
+          <w:rFonts w:ascii="Consolas" w:eastAsia="Times New Roman" w:hAnsi="Consolas" w:cs="Times New Roman"/>
+          <w:color w:val="0550AE"/>
+          <w:kern w:val="0"/>
+          <w:sz w:val="21"/>
+          <w:szCs w:val="21"/>
+          <w14:ligatures w14:val="none"/>
+        </w:rPr>
+        <w:t>socket</w:t>
+      </w:r>
+      <w:r>
+        <w:rPr>
+          <w:rFonts w:ascii="Consolas" w:eastAsia="Times New Roman" w:hAnsi="Consolas" w:cs="Times New Roman"/>
+          <w:color w:val="1F2328"/>
+          <w:kern w:val="0"/>
+          <w:sz w:val="21"/>
+          <w:szCs w:val="21"/>
+          <w14:ligatures w14:val="none"/>
+        </w:rPr>
+        <w:t>?.</w:t>
+      </w:r>
+      <w:proofErr w:type="gramEnd"/>
+      <w:r>
+        <w:rPr>
+          <w:rFonts w:ascii="Consolas" w:eastAsia="Times New Roman" w:hAnsi="Consolas" w:cs="Times New Roman"/>
+          <w:color w:val="1F2328"/>
+          <w:kern w:val="0"/>
+          <w:sz w:val="21"/>
+          <w:szCs w:val="21"/>
+          <w14:ligatures w14:val="none"/>
+        </w:rPr>
+        <w:t>connected) {</w:t>
+      </w:r>
+    </w:p>
+    <w:p>
+      <w:pPr>
+        <w:shd w:val="clear" w:color="auto" w:fill="FFFFFF"/>
+        <w:spacing w:after="0" w:line="285" w:lineRule="atLeast"/>
+        <w:rPr>
+          <w:rFonts w:ascii="Consolas" w:eastAsia="Times New Roman" w:hAnsi="Consolas" w:cs="Times New Roman"/>
+          <w:color w:val="202020"/>
+          <w:kern w:val="0"/>
+          <w:sz w:val="21"/>
+          <w:szCs w:val="21"/>
+          <w14:ligatures w14:val="none"/>
+        </w:rPr>
+      </w:pPr>
+      <w:r>
+        <w:rPr>
+          <w:rFonts w:ascii="Consolas" w:eastAsia="Times New Roman" w:hAnsi="Consolas" w:cs="Times New Roman"/>
+          <w:color w:val="1F2328"/>
+          <w:kern w:val="0"/>
+          <w:sz w:val="21"/>
+          <w:szCs w:val="21"/>
+          <w14:ligatures w14:val="none"/>
+        </w:rPr>
+        <w:t xml:space="preserve">                </w:t>
+      </w:r>
+      <w:proofErr w:type="gramStart"/>
+      <w:r>
+        <w:rPr>
+          <w:rFonts w:ascii="Consolas" w:eastAsia="Times New Roman" w:hAnsi="Consolas" w:cs="Times New Roman"/>
+          <w:color w:val="0550AE"/>
+          <w:kern w:val="0"/>
+          <w:sz w:val="21"/>
+          <w:szCs w:val="21"/>
+          <w14:ligatures w14:val="none"/>
+        </w:rPr>
+        <w:t>socket</w:t>
+      </w:r>
+      <w:r>
+        <w:rPr>
+          <w:rFonts w:ascii="Consolas" w:eastAsia="Times New Roman" w:hAnsi="Consolas" w:cs="Times New Roman"/>
+          <w:color w:val="1F2328"/>
+          <w:kern w:val="0"/>
+          <w:sz w:val="21"/>
+          <w:szCs w:val="21"/>
+          <w14:ligatures w14:val="none"/>
+        </w:rPr>
+        <w:t>?.</w:t>
+      </w:r>
+      <w:proofErr w:type="gramEnd"/>
+      <w:r>
+        <w:rPr>
+          <w:rFonts w:ascii="Consolas" w:eastAsia="Times New Roman" w:hAnsi="Consolas" w:cs="Times New Roman"/>
+          <w:color w:val="8250DF"/>
+          <w:kern w:val="0"/>
+          <w:sz w:val="21"/>
+          <w:szCs w:val="21"/>
+          <w14:ligatures w14:val="none"/>
+        </w:rPr>
+        <w:t>off</w:t>
+      </w:r>
+      <w:r>
+        <w:rPr>
+          <w:rFonts w:ascii="Consolas" w:eastAsia="Times New Roman" w:hAnsi="Consolas" w:cs="Times New Roman"/>
+          <w:color w:val="1F2328"/>
+          <w:kern w:val="0"/>
+          <w:sz w:val="21"/>
+          <w:szCs w:val="21"/>
+          <w14:ligatures w14:val="none"/>
+        </w:rPr>
+        <w:t>(</w:t>
+      </w:r>
+      <w:r>
+        <w:rPr>
+          <w:rFonts w:ascii="Consolas" w:eastAsia="Times New Roman" w:hAnsi="Consolas" w:cs="Times New Roman"/>
+          <w:color w:val="0A3069"/>
+          <w:kern w:val="0"/>
+          <w:sz w:val="21"/>
+          <w:szCs w:val="21"/>
+          <w14:ligatures w14:val="none"/>
+        </w:rPr>
+        <w:t>"getOnlineUsers"</w:t>
+      </w:r>
+      <w:r>
+        <w:rPr>
+          <w:rFonts w:ascii="Consolas" w:eastAsia="Times New Roman" w:hAnsi="Consolas" w:cs="Times New Roman"/>
+          <w:color w:val="1F2328"/>
+          <w:kern w:val="0"/>
+          <w:sz w:val="21"/>
+          <w:szCs w:val="21"/>
+          <w14:ligatures w14:val="none"/>
+        </w:rPr>
+        <w:t>);</w:t>
+      </w:r>
+    </w:p>
+    <w:p>
+      <w:pPr>
+        <w:shd w:val="clear" w:color="auto" w:fill="FFFFFF"/>
+        <w:spacing w:after="0" w:line="285" w:lineRule="atLeast"/>
+        <w:rPr>
+          <w:rFonts w:ascii="Consolas" w:eastAsia="Times New Roman" w:hAnsi="Consolas" w:cs="Times New Roman"/>
+          <w:color w:val="202020"/>
+          <w:kern w:val="0"/>
+          <w:sz w:val="21"/>
+          <w:szCs w:val="21"/>
+          <w14:ligatures w14:val="none"/>
+        </w:rPr>
+      </w:pPr>
+      <w:r>
+        <w:rPr>
+          <w:rFonts w:ascii="Consolas" w:eastAsia="Times New Roman" w:hAnsi="Consolas" w:cs="Times New Roman"/>
+          <w:color w:val="1F2328"/>
+          <w:kern w:val="0"/>
+          <w:sz w:val="21"/>
+          <w:szCs w:val="21"/>
+          <w14:ligatures w14:val="none"/>
+        </w:rPr>
+        <w:t xml:space="preserve">                </w:t>
+      </w:r>
+      <w:proofErr w:type="gramStart"/>
+      <w:r>
+        <w:rPr>
+          <w:rFonts w:ascii="Consolas" w:eastAsia="Times New Roman" w:hAnsi="Consolas" w:cs="Times New Roman"/>
+          <w:color w:val="0550AE"/>
+          <w:kern w:val="0"/>
+          <w:sz w:val="21"/>
+          <w:szCs w:val="21"/>
+          <w14:ligatures w14:val="none"/>
+        </w:rPr>
+        <w:t>socket</w:t>
+      </w:r>
+      <w:r>
+        <w:rPr>
+          <w:rFonts w:ascii="Consolas" w:eastAsia="Times New Roman" w:hAnsi="Consolas" w:cs="Times New Roman"/>
+          <w:color w:val="1F2328"/>
+          <w:kern w:val="0"/>
+          <w:sz w:val="21"/>
+          <w:szCs w:val="21"/>
+          <w14:ligatures w14:val="none"/>
+        </w:rPr>
+        <w:t>?.</w:t>
+      </w:r>
+      <w:proofErr w:type="gramEnd"/>
+      <w:r>
+        <w:rPr>
+          <w:rFonts w:ascii="Consolas" w:eastAsia="Times New Roman" w:hAnsi="Consolas" w:cs="Times New Roman"/>
+          <w:color w:val="8250DF"/>
+          <w:kern w:val="0"/>
+          <w:sz w:val="21"/>
+          <w:szCs w:val="21"/>
+          <w14:ligatures w14:val="none"/>
+        </w:rPr>
+        <w:t>off</w:t>
+      </w:r>
+      <w:r>
+        <w:rPr>
+          <w:rFonts w:ascii="Consolas" w:eastAsia="Times New Roman" w:hAnsi="Consolas" w:cs="Times New Roman"/>
+          <w:color w:val="1F2328"/>
+          <w:kern w:val="0"/>
+          <w:sz w:val="21"/>
+          <w:szCs w:val="21"/>
+          <w14:ligatures w14:val="none"/>
+        </w:rPr>
+        <w:t>(</w:t>
+      </w:r>
+      <w:r>
+        <w:rPr>
+          <w:rFonts w:ascii="Consolas" w:eastAsia="Times New Roman" w:hAnsi="Consolas" w:cs="Times New Roman"/>
+          <w:color w:val="0A3069"/>
+          <w:kern w:val="0"/>
+          <w:sz w:val="21"/>
+          <w:szCs w:val="21"/>
+          <w14:ligatures w14:val="none"/>
+        </w:rPr>
+        <w:t>"getMessage"</w:t>
+      </w:r>
+      <w:r>
+        <w:rPr>
+          <w:rFonts w:ascii="Consolas" w:eastAsia="Times New Roman" w:hAnsi="Consolas" w:cs="Times New Roman"/>
+          <w:color w:val="1F2328"/>
+          <w:kern w:val="0"/>
+          <w:sz w:val="21"/>
+          <w:szCs w:val="21"/>
+          <w14:ligatures w14:val="none"/>
+        </w:rPr>
+        <w:t>);</w:t>
+      </w:r>
+    </w:p>
+    <w:p>
+      <w:pPr>
+        <w:shd w:val="clear" w:color="auto" w:fill="FFFFFF"/>
+        <w:spacing w:after="0" w:line="285" w:lineRule="atLeast"/>
+        <w:rPr>
+          <w:rFonts w:ascii="Consolas" w:eastAsia="Times New Roman" w:hAnsi="Consolas" w:cs="Times New Roman"/>
+          <w:color w:val="202020"/>
+          <w:kern w:val="0"/>
+          <w:sz w:val="21"/>
+          <w:szCs w:val="21"/>
+          <w14:ligatures w14:val="none"/>
+        </w:rPr>
+      </w:pPr>
+      <w:r>
+        <w:rPr>
+          <w:rFonts w:ascii="Consolas" w:eastAsia="Times New Roman" w:hAnsi="Consolas" w:cs="Times New Roman"/>
+          <w:color w:val="1F2328"/>
+          <w:kern w:val="0"/>
+          <w:sz w:val="21"/>
+          <w:szCs w:val="21"/>
+          <w14:ligatures w14:val="none"/>
+        </w:rPr>
+        <w:t xml:space="preserve">                </w:t>
+      </w:r>
+      <w:proofErr w:type="gramStart"/>
+      <w:r>
+        <w:rPr>
+          <w:rFonts w:ascii="Consolas" w:eastAsia="Times New Roman" w:hAnsi="Consolas" w:cs="Times New Roman"/>
+          <w:color w:val="0550AE"/>
+          <w:kern w:val="0"/>
+          <w:sz w:val="21"/>
+          <w:szCs w:val="21"/>
+          <w14:ligatures w14:val="none"/>
+        </w:rPr>
+        <w:t>socket</w:t>
+      </w:r>
+      <w:r>
+        <w:rPr>
+          <w:rFonts w:ascii="Consolas" w:eastAsia="Times New Roman" w:hAnsi="Consolas" w:cs="Times New Roman"/>
+          <w:color w:val="1F2328"/>
+          <w:kern w:val="0"/>
+          <w:sz w:val="21"/>
+          <w:szCs w:val="21"/>
+          <w14:ligatures w14:val="none"/>
+        </w:rPr>
+        <w:t>?.</w:t>
+      </w:r>
+      <w:proofErr w:type="gramEnd"/>
+      <w:r>
+        <w:rPr>
+          <w:rFonts w:ascii="Consolas" w:eastAsia="Times New Roman" w:hAnsi="Consolas" w:cs="Times New Roman"/>
+          <w:color w:val="8250DF"/>
+          <w:kern w:val="0"/>
+          <w:sz w:val="21"/>
+          <w:szCs w:val="21"/>
+          <w14:ligatures w14:val="none"/>
+        </w:rPr>
+        <w:t>off</w:t>
+      </w:r>
+      <w:r>
+        <w:rPr>
+          <w:rFonts w:ascii="Consolas" w:eastAsia="Times New Roman" w:hAnsi="Consolas" w:cs="Times New Roman"/>
+          <w:color w:val="1F2328"/>
+          <w:kern w:val="0"/>
+          <w:sz w:val="21"/>
+          <w:szCs w:val="21"/>
+          <w14:ligatures w14:val="none"/>
+        </w:rPr>
+        <w:t>(</w:t>
+      </w:r>
+      <w:r>
+        <w:rPr>
+          <w:rFonts w:ascii="Consolas" w:eastAsia="Times New Roman" w:hAnsi="Consolas" w:cs="Times New Roman"/>
+          <w:color w:val="0A3069"/>
+          <w:kern w:val="0"/>
+          <w:sz w:val="21"/>
+          <w:szCs w:val="21"/>
+          <w14:ligatures w14:val="none"/>
+        </w:rPr>
+        <w:t>"getNotification"</w:t>
+      </w:r>
+      <w:r>
+        <w:rPr>
+          <w:rFonts w:ascii="Consolas" w:eastAsia="Times New Roman" w:hAnsi="Consolas" w:cs="Times New Roman"/>
+          <w:color w:val="1F2328"/>
+          <w:kern w:val="0"/>
+          <w:sz w:val="21"/>
+          <w:szCs w:val="21"/>
+          <w14:ligatures w14:val="none"/>
+        </w:rPr>
+        <w:t>);</w:t>
+      </w:r>
+    </w:p>
+    <w:p>
+      <w:pPr>
+        <w:shd w:val="clear" w:color="auto" w:fill="FFFFFF"/>
+        <w:spacing w:after="0" w:line="285" w:lineRule="atLeast"/>
+        <w:rPr>
+          <w:rFonts w:ascii="Consolas" w:eastAsia="Times New Roman" w:hAnsi="Consolas" w:cs="Times New Roman"/>
+          <w:color w:val="202020"/>
+          <w:kern w:val="0"/>
+          <w:sz w:val="21"/>
+          <w:szCs w:val="21"/>
+          <w14:ligatures w14:val="none"/>
+        </w:rPr>
+      </w:pPr>
+      <w:r>
+        <w:rPr>
+          <w:rFonts w:ascii="Consolas" w:eastAsia="Times New Roman" w:hAnsi="Consolas" w:cs="Times New Roman"/>
+          <w:color w:val="1F2328"/>
+          <w:kern w:val="0"/>
+          <w:sz w:val="21"/>
+          <w:szCs w:val="21"/>
+          <w14:ligatures w14:val="none"/>
+        </w:rPr>
+        <w:t xml:space="preserve">                </w:t>
+      </w:r>
+      <w:r>
+        <w:rPr>
+          <w:rFonts w:ascii="Consolas" w:eastAsia="Times New Roman" w:hAnsi="Consolas" w:cs="Times New Roman"/>
+          <w:color w:val="0550AE"/>
+          <w:kern w:val="0"/>
+          <w:sz w:val="21"/>
+          <w:szCs w:val="21"/>
+          <w14:ligatures w14:val="none"/>
+        </w:rPr>
+        <w:t>localStorage</w:t>
+      </w:r>
+      <w:r>
+        <w:rPr>
+          <w:rFonts w:ascii="Consolas" w:eastAsia="Times New Roman" w:hAnsi="Consolas" w:cs="Times New Roman"/>
+          <w:color w:val="1F2328"/>
+          <w:kern w:val="0"/>
+          <w:sz w:val="21"/>
+          <w:szCs w:val="21"/>
+          <w14:ligatures w14:val="none"/>
+        </w:rPr>
+        <w:t>.</w:t>
+      </w:r>
+      <w:r>
+        <w:rPr>
+          <w:rFonts w:ascii="Consolas" w:eastAsia="Times New Roman" w:hAnsi="Consolas" w:cs="Times New Roman"/>
+          <w:color w:val="8250DF"/>
+          <w:kern w:val="0"/>
+          <w:sz w:val="21"/>
+          <w:szCs w:val="21"/>
+          <w14:ligatures w14:val="none"/>
+        </w:rPr>
+        <w:t>setItem</w:t>
+      </w:r>
+      <w:r>
+        <w:rPr>
+          <w:rFonts w:ascii="Consolas" w:eastAsia="Times New Roman" w:hAnsi="Consolas" w:cs="Times New Roman"/>
+          <w:color w:val="1F2328"/>
+          <w:kern w:val="0"/>
+          <w:sz w:val="21"/>
+          <w:szCs w:val="21"/>
+          <w14:ligatures w14:val="none"/>
+        </w:rPr>
+        <w:t>(</w:t>
+      </w:r>
+      <w:r>
+        <w:rPr>
+          <w:rFonts w:ascii="Consolas" w:eastAsia="Times New Roman" w:hAnsi="Consolas" w:cs="Times New Roman"/>
+          <w:color w:val="0A3069"/>
+          <w:kern w:val="0"/>
+          <w:sz w:val="21"/>
+          <w:szCs w:val="21"/>
+          <w14:ligatures w14:val="none"/>
+        </w:rPr>
+        <w:t>"currentChat"</w:t>
+      </w:r>
+      <w:r>
+        <w:rPr>
+          <w:rFonts w:ascii="Consolas" w:eastAsia="Times New Roman" w:hAnsi="Consolas" w:cs="Times New Roman"/>
+          <w:color w:val="1F2328"/>
+          <w:kern w:val="0"/>
+          <w:sz w:val="21"/>
+          <w:szCs w:val="21"/>
+          <w14:ligatures w14:val="none"/>
+        </w:rPr>
+        <w:t xml:space="preserve">, </w:t>
+      </w:r>
+      <w:r>
+        <w:rPr>
+          <w:rFonts w:ascii="Consolas" w:eastAsia="Times New Roman" w:hAnsi="Consolas" w:cs="Times New Roman"/>
+          <w:color w:val="0A3069"/>
+          <w:kern w:val="0"/>
+          <w:sz w:val="21"/>
+          <w:szCs w:val="21"/>
+          <w14:ligatures w14:val="none"/>
+        </w:rPr>
+        <w:t>""</w:t>
+      </w:r>
+      <w:r>
+        <w:rPr>
+          <w:rFonts w:ascii="Consolas" w:eastAsia="Times New Roman" w:hAnsi="Consolas" w:cs="Times New Roman"/>
+          <w:color w:val="1F2328"/>
+          <w:kern w:val="0"/>
+          <w:sz w:val="21"/>
+          <w:szCs w:val="21"/>
+          <w14:ligatures w14:val="none"/>
+        </w:rPr>
+        <w:t>);</w:t>
+      </w:r>
+    </w:p>
+    <w:p>
+      <w:pPr>
+        <w:shd w:val="clear" w:color="auto" w:fill="FFFFFF"/>
+        <w:spacing w:after="0" w:line="285" w:lineRule="atLeast"/>
+        <w:rPr>
+          <w:rFonts w:ascii="Consolas" w:eastAsia="Times New Roman" w:hAnsi="Consolas" w:cs="Times New Roman"/>
+          <w:color w:val="202020"/>
+          <w:kern w:val="0"/>
+          <w:sz w:val="21"/>
+          <w:szCs w:val="21"/>
+          <w14:ligatures w14:val="none"/>
+        </w:rPr>
+      </w:pPr>
+      <w:r>
+        <w:rPr>
+          <w:rFonts w:ascii="Consolas" w:eastAsia="Times New Roman" w:hAnsi="Consolas" w:cs="Times New Roman"/>
+          <w:color w:val="1F2328"/>
+          <w:kern w:val="0"/>
+          <w:sz w:val="21"/>
+          <w:szCs w:val="21"/>
+          <w14:ligatures w14:val="none"/>
+        </w:rPr>
+        <w:t>            }</w:t>
+      </w:r>
+    </w:p>
+    <w:p>
+      <w:pPr>
+        <w:shd w:val="clear" w:color="auto" w:fill="FFFFFF"/>
+        <w:spacing w:after="0" w:line="285" w:lineRule="atLeast"/>
+        <w:rPr>
+          <w:rFonts w:ascii="Consolas" w:eastAsia="Times New Roman" w:hAnsi="Consolas" w:cs="Times New Roman"/>
+          <w:color w:val="202020"/>
+          <w:kern w:val="0"/>
+          <w:sz w:val="21"/>
+          <w:szCs w:val="21"/>
+          <w14:ligatures w14:val="none"/>
+        </w:rPr>
+      </w:pPr>
+      <w:r>
+        <w:rPr>
+          <w:rFonts w:ascii="Consolas" w:eastAsia="Times New Roman" w:hAnsi="Consolas" w:cs="Times New Roman"/>
+          <w:color w:val="1F2328"/>
+          <w:kern w:val="0"/>
+          <w:sz w:val="21"/>
+          <w:szCs w:val="21"/>
+          <w14:ligatures w14:val="none"/>
+        </w:rPr>
+        <w:t>        };</w:t>
+      </w:r>
+    </w:p>
+    <w:p>
+      <w:pPr>
+        <w:shd w:val="clear" w:color="auto" w:fill="FFFFFF"/>
+        <w:spacing w:after="0" w:line="285" w:lineRule="atLeast"/>
+        <w:rPr>
+          <w:rFonts w:ascii="Consolas" w:eastAsia="Times New Roman" w:hAnsi="Consolas" w:cs="Times New Roman"/>
+          <w:color w:val="202020"/>
+          <w:kern w:val="0"/>
+          <w:sz w:val="21"/>
+          <w:szCs w:val="21"/>
+          <w14:ligatures w14:val="none"/>
+        </w:rPr>
+      </w:pPr>
+      <w:r>
+        <w:rPr>
+          <w:rFonts w:ascii="Consolas" w:eastAsia="Times New Roman" w:hAnsi="Consolas" w:cs="Times New Roman"/>
+          <w:color w:val="1F2328"/>
+          <w:kern w:val="0"/>
+          <w:sz w:val="21"/>
+          <w:szCs w:val="21"/>
+          <w14:ligatures w14:val="none"/>
+        </w:rPr>
+        <w:t>    }, [</w:t>
+      </w:r>
+      <w:r>
+        <w:rPr>
+          <w:rFonts w:ascii="Consolas" w:eastAsia="Times New Roman" w:hAnsi="Consolas" w:cs="Times New Roman"/>
+          <w:color w:val="953800"/>
+          <w:kern w:val="0"/>
+          <w:sz w:val="21"/>
+          <w:szCs w:val="21"/>
+          <w14:ligatures w14:val="none"/>
+        </w:rPr>
+        <w:t>user</w:t>
+      </w:r>
+      <w:r>
+        <w:rPr>
+          <w:rFonts w:ascii="Consolas" w:eastAsia="Times New Roman" w:hAnsi="Consolas" w:cs="Times New Roman"/>
+          <w:color w:val="1F2328"/>
+          <w:kern w:val="0"/>
+          <w:sz w:val="21"/>
+          <w:szCs w:val="21"/>
+          <w14:ligatures w14:val="none"/>
+        </w:rPr>
+        <w:t>]);</w:t>
+      </w:r>
+    </w:p>
+    <w:p>
+      <w:pPr>
+        <w:ind w:left="1440" w:firstLine="720"/>
+        <w:rPr>
+          <w:rFonts w:ascii="Sakkal Majalla" w:eastAsia="Times New Roman" w:hAnsi="Sakkal Majalla" w:cs="Sakkal Majalla"/>
+          <w:color w:val="202020"/>
+          <w:kern w:val="0"/>
+          <w14:ligatures w14:val="none"/>
+        </w:rPr>
+      </w:pPr>
+      <w:r>
+        <w:rPr>
+          <w:rFonts w:ascii="Sakkal Majalla" w:eastAsia="Times New Roman" w:hAnsi="Sakkal Majalla" w:cs="Sakkal Majalla"/>
+          <w:color w:val="202020"/>
+          <w:kern w:val="0"/>
+          <w14:ligatures w14:val="none"/>
+        </w:rPr>
+        <w:t>======================================================</w:t>
+      </w:r>
+    </w:p>
+    <w:p>
+      <w:pPr>
+        <w:rPr>
+          <w:rFonts w:ascii="Sakkal Majalla" w:eastAsia="Times New Roman" w:hAnsi="Sakkal Majalla" w:cs="Sakkal Majalla"/>
+          <w:color w:val="202020"/>
+          <w:kern w:val="0"/>
+          <w14:ligatures w14:val="none"/>
+        </w:rPr>
+      </w:pPr>
+      <w:r>
+        <w:rPr>
+          <w:rFonts w:ascii="Sakkal Majalla" w:eastAsia="Times New Roman" w:hAnsi="Sakkal Majalla" w:cs="Sakkal Majalla"/>
+          <w:color w:val="202020"/>
+          <w:kern w:val="0"/>
+          <w14:ligatures w14:val="none"/>
+        </w:rPr>
+        <w:t>To listen to the Socket.IO events:</w:t>
+      </w:r>
+    </w:p>
+    <w:p>
+      <w:pPr>
+        <w:shd w:val="clear" w:color="auto" w:fill="FFFFFF"/>
+        <w:spacing w:after="0" w:line="285" w:lineRule="atLeast"/>
+        <w:rPr>
+          <w:rFonts w:ascii="Consolas" w:eastAsia="Times New Roman" w:hAnsi="Consolas" w:cs="Times New Roman"/>
+          <w:color w:val="202020"/>
+          <w:kern w:val="0"/>
+          <w:sz w:val="21"/>
+          <w:szCs w:val="21"/>
+          <w14:ligatures w14:val="none"/>
+        </w:rPr>
+      </w:pPr>
+      <w:r>
+        <w:rPr>
+          <w:rFonts w:ascii="Consolas" w:eastAsia="Times New Roman" w:hAnsi="Consolas" w:cs="Times New Roman"/>
+          <w:color w:val="1F2328"/>
+          <w:kern w:val="0"/>
+          <w:sz w:val="21"/>
+          <w:szCs w:val="21"/>
+          <w14:ligatures w14:val="none"/>
+        </w:rPr>
+        <w:t xml:space="preserve">        </w:t>
+      </w:r>
+      <w:r>
+        <w:rPr>
+          <w:rFonts w:ascii="Consolas" w:eastAsia="Times New Roman" w:hAnsi="Consolas" w:cs="Times New Roman"/>
+          <w:color w:val="0550AE"/>
+          <w:kern w:val="0"/>
+          <w:sz w:val="21"/>
+          <w:szCs w:val="21"/>
+          <w14:ligatures w14:val="none"/>
+        </w:rPr>
+        <w:t>socket</w:t>
+      </w:r>
+      <w:r>
+        <w:rPr>
+          <w:rFonts w:ascii="Consolas" w:eastAsia="Times New Roman" w:hAnsi="Consolas" w:cs="Times New Roman"/>
+          <w:color w:val="1F2328"/>
+          <w:kern w:val="0"/>
+          <w:sz w:val="21"/>
+          <w:szCs w:val="21"/>
+          <w14:ligatures w14:val="none"/>
+        </w:rPr>
+        <w:t>?.</w:t>
+      </w:r>
+      <w:proofErr w:type="gramStart"/>
+      <w:r>
+        <w:rPr>
+          <w:rFonts w:ascii="Consolas" w:eastAsia="Times New Roman" w:hAnsi="Consolas" w:cs="Times New Roman"/>
+          <w:color w:val="8250DF"/>
+          <w:kern w:val="0"/>
+          <w:sz w:val="21"/>
+          <w:szCs w:val="21"/>
+          <w14:ligatures w14:val="none"/>
+        </w:rPr>
+        <w:t>on</w:t>
+      </w:r>
+      <w:r>
+        <w:rPr>
+          <w:rFonts w:ascii="Consolas" w:eastAsia="Times New Roman" w:hAnsi="Consolas" w:cs="Times New Roman"/>
+          <w:color w:val="1F2328"/>
+          <w:kern w:val="0"/>
+          <w:sz w:val="21"/>
+          <w:szCs w:val="21"/>
+          <w14:ligatures w14:val="none"/>
+        </w:rPr>
+        <w:t>(</w:t>
+      </w:r>
+      <w:proofErr w:type="gramEnd"/>
+      <w:r>
+        <w:rPr>
+          <w:rFonts w:ascii="Consolas" w:eastAsia="Times New Roman" w:hAnsi="Consolas" w:cs="Times New Roman"/>
+          <w:color w:val="0A3069"/>
+          <w:kern w:val="0"/>
+          <w:sz w:val="21"/>
+          <w:szCs w:val="21"/>
+          <w14:ligatures w14:val="none"/>
+        </w:rPr>
+        <w:t>"getMessage"</w:t>
+      </w:r>
+      <w:r>
+        <w:rPr>
+          <w:rFonts w:ascii="Consolas" w:eastAsia="Times New Roman" w:hAnsi="Consolas" w:cs="Times New Roman"/>
+          <w:color w:val="1F2328"/>
+          <w:kern w:val="0"/>
+          <w:sz w:val="21"/>
+          <w:szCs w:val="21"/>
+          <w14:ligatures w14:val="none"/>
+        </w:rPr>
+        <w:t>, (</w:t>
+      </w:r>
+      <w:r>
+        <w:rPr>
+          <w:rFonts w:ascii="Consolas" w:eastAsia="Times New Roman" w:hAnsi="Consolas" w:cs="Times New Roman"/>
+          <w:color w:val="953800"/>
+          <w:kern w:val="0"/>
+          <w:sz w:val="21"/>
+          <w:szCs w:val="21"/>
+          <w14:ligatures w14:val="none"/>
+        </w:rPr>
+        <w:t>message</w:t>
+      </w:r>
+      <w:r>
+        <w:rPr>
+          <w:rFonts w:ascii="Consolas" w:eastAsia="Times New Roman" w:hAnsi="Consolas" w:cs="Times New Roman"/>
+          <w:color w:val="000000"/>
+          <w:kern w:val="0"/>
+          <w:sz w:val="21"/>
+          <w:szCs w:val="21"/>
+          <w14:ligatures w14:val="none"/>
+        </w:rPr>
+        <w:t>:</w:t>
+      </w:r>
+      <w:r>
+        <w:rPr>
+          <w:rFonts w:ascii="Consolas" w:eastAsia="Times New Roman" w:hAnsi="Consolas" w:cs="Times New Roman"/>
+          <w:color w:val="1F2328"/>
+          <w:kern w:val="0"/>
+          <w:sz w:val="21"/>
+          <w:szCs w:val="21"/>
+          <w14:ligatures w14:val="none"/>
+        </w:rPr>
+        <w:t xml:space="preserve"> </w:t>
+      </w:r>
+      <w:r>
+        <w:rPr>
+          <w:rFonts w:ascii="Consolas" w:eastAsia="Times New Roman" w:hAnsi="Consolas" w:cs="Times New Roman"/>
+          <w:color w:val="267F99"/>
+          <w:kern w:val="0"/>
+          <w:sz w:val="21"/>
+          <w:szCs w:val="21"/>
+          <w14:ligatures w14:val="none"/>
+        </w:rPr>
+        <w:t>MessageCD</w:t>
+      </w:r>
+      <w:r>
+        <w:rPr>
+          <w:rFonts w:ascii="Consolas" w:eastAsia="Times New Roman" w:hAnsi="Consolas" w:cs="Times New Roman"/>
+          <w:color w:val="1F2328"/>
+          <w:kern w:val="0"/>
+          <w:sz w:val="21"/>
+          <w:szCs w:val="21"/>
+          <w14:ligatures w14:val="none"/>
+        </w:rPr>
+        <w:t xml:space="preserve">) </w:t>
+      </w:r>
+      <w:r>
+        <w:rPr>
+          <w:rFonts w:ascii="Consolas" w:eastAsia="Times New Roman" w:hAnsi="Consolas" w:cs="Times New Roman"/>
+          <w:color w:val="CF222E"/>
+          <w:kern w:val="0"/>
+          <w:sz w:val="21"/>
+          <w:szCs w:val="21"/>
+          <w14:ligatures w14:val="none"/>
+        </w:rPr>
+        <w:t>=&gt;</w:t>
+      </w:r>
+      <w:r>
+        <w:rPr>
+          <w:rFonts w:ascii="Consolas" w:eastAsia="Times New Roman" w:hAnsi="Consolas" w:cs="Times New Roman"/>
+          <w:color w:val="1F2328"/>
+          <w:kern w:val="0"/>
+          <w:sz w:val="21"/>
+          <w:szCs w:val="21"/>
+          <w14:ligatures w14:val="none"/>
+        </w:rPr>
+        <w:t xml:space="preserve"> {</w:t>
+      </w:r>
+    </w:p>
+    <w:p>
+      <w:pPr>
+        <w:shd w:val="clear" w:color="auto" w:fill="FFFFFF"/>
+        <w:spacing w:after="0" w:line="285" w:lineRule="atLeast"/>
+        <w:rPr>
+          <w:rFonts w:ascii="Consolas" w:eastAsia="Times New Roman" w:hAnsi="Consolas" w:cs="Times New Roman"/>
+          <w:color w:val="202020"/>
+          <w:kern w:val="0"/>
+          <w:sz w:val="21"/>
+          <w:szCs w:val="21"/>
+          <w14:ligatures w14:val="none"/>
+        </w:rPr>
+      </w:pPr>
+      <w:r>
+        <w:rPr>
+          <w:rFonts w:ascii="Consolas" w:eastAsia="Times New Roman" w:hAnsi="Consolas" w:cs="Times New Roman"/>
+          <w:color w:val="1F2328"/>
+          <w:kern w:val="0"/>
+          <w:sz w:val="21"/>
+          <w:szCs w:val="21"/>
+          <w14:ligatures w14:val="none"/>
+        </w:rPr>
+        <w:t xml:space="preserve">            </w:t>
+      </w:r>
+      <w:r>
+        <w:rPr>
+          <w:rFonts w:ascii="Consolas" w:eastAsia="Times New Roman" w:hAnsi="Consolas" w:cs="Times New Roman"/>
+          <w:color w:val="CF222E"/>
+          <w:kern w:val="0"/>
+          <w:sz w:val="21"/>
+          <w:szCs w:val="21"/>
+          <w14:ligatures w14:val="none"/>
+        </w:rPr>
+        <w:t>const</w:t>
+      </w:r>
+      <w:r>
+        <w:rPr>
+          <w:rFonts w:ascii="Consolas" w:eastAsia="Times New Roman" w:hAnsi="Consolas" w:cs="Times New Roman"/>
+          <w:color w:val="1F2328"/>
+          <w:kern w:val="0"/>
+          <w:sz w:val="21"/>
+          <w:szCs w:val="21"/>
+          <w14:ligatures w14:val="none"/>
+        </w:rPr>
+        <w:t xml:space="preserve"> </w:t>
+      </w:r>
+      <w:r>
+        <w:rPr>
+          <w:rFonts w:ascii="Consolas" w:eastAsia="Times New Roman" w:hAnsi="Consolas" w:cs="Times New Roman"/>
+          <w:color w:val="0550AE"/>
+          <w:kern w:val="0"/>
+          <w:sz w:val="21"/>
+          <w:szCs w:val="21"/>
+          <w14:ligatures w14:val="none"/>
+        </w:rPr>
+        <w:t>t1</w:t>
+      </w:r>
+      <w:r>
+        <w:rPr>
+          <w:rFonts w:ascii="Consolas" w:eastAsia="Times New Roman" w:hAnsi="Consolas" w:cs="Times New Roman"/>
+          <w:color w:val="1F2328"/>
+          <w:kern w:val="0"/>
+          <w:sz w:val="21"/>
+          <w:szCs w:val="21"/>
+          <w14:ligatures w14:val="none"/>
+        </w:rPr>
+        <w:t xml:space="preserve"> </w:t>
+      </w:r>
+      <w:r>
+        <w:rPr>
+          <w:rFonts w:ascii="Consolas" w:eastAsia="Times New Roman" w:hAnsi="Consolas" w:cs="Times New Roman"/>
+          <w:color w:val="000000"/>
+          <w:kern w:val="0"/>
+          <w:sz w:val="21"/>
+          <w:szCs w:val="21"/>
+          <w14:ligatures w14:val="none"/>
+        </w:rPr>
+        <w:t>=</w:t>
+      </w:r>
+      <w:r>
+        <w:rPr>
+          <w:rFonts w:ascii="Consolas" w:eastAsia="Times New Roman" w:hAnsi="Consolas" w:cs="Times New Roman"/>
+          <w:color w:val="1F2328"/>
+          <w:kern w:val="0"/>
+          <w:sz w:val="21"/>
+          <w:szCs w:val="21"/>
+          <w14:ligatures w14:val="none"/>
+        </w:rPr>
+        <w:t xml:space="preserve"> </w:t>
+      </w:r>
+      <w:r>
+        <w:rPr>
+          <w:rFonts w:ascii="Consolas" w:eastAsia="Times New Roman" w:hAnsi="Consolas" w:cs="Times New Roman"/>
+          <w:color w:val="0550AE"/>
+          <w:kern w:val="0"/>
+          <w:sz w:val="21"/>
+          <w:szCs w:val="21"/>
+          <w14:ligatures w14:val="none"/>
+        </w:rPr>
+        <w:t>localStorage</w:t>
+      </w:r>
+      <w:r>
+        <w:rPr>
+          <w:rFonts w:ascii="Consolas" w:eastAsia="Times New Roman" w:hAnsi="Consolas" w:cs="Times New Roman"/>
+          <w:color w:val="1F2328"/>
+          <w:kern w:val="0"/>
+          <w:sz w:val="21"/>
+          <w:szCs w:val="21"/>
+          <w14:ligatures w14:val="none"/>
+        </w:rPr>
+        <w:t>.</w:t>
+      </w:r>
+      <w:r>
+        <w:rPr>
+          <w:rFonts w:ascii="Consolas" w:eastAsia="Times New Roman" w:hAnsi="Consolas" w:cs="Times New Roman"/>
+          <w:color w:val="8250DF"/>
+          <w:kern w:val="0"/>
+          <w:sz w:val="21"/>
+          <w:szCs w:val="21"/>
+          <w14:ligatures w14:val="none"/>
+        </w:rPr>
+        <w:t>getItem</w:t>
+      </w:r>
+      <w:r>
+        <w:rPr>
+          <w:rFonts w:ascii="Consolas" w:eastAsia="Times New Roman" w:hAnsi="Consolas" w:cs="Times New Roman"/>
+          <w:color w:val="1F2328"/>
+          <w:kern w:val="0"/>
+          <w:sz w:val="21"/>
+          <w:szCs w:val="21"/>
+          <w14:ligatures w14:val="none"/>
+        </w:rPr>
+        <w:t>(</w:t>
+      </w:r>
+      <w:r>
+        <w:rPr>
+          <w:rFonts w:ascii="Consolas" w:eastAsia="Times New Roman" w:hAnsi="Consolas" w:cs="Times New Roman"/>
+          <w:color w:val="0A3069"/>
+          <w:kern w:val="0"/>
+          <w:sz w:val="21"/>
+          <w:szCs w:val="21"/>
+          <w14:ligatures w14:val="none"/>
+        </w:rPr>
+        <w:t>"currentChat"</w:t>
+      </w:r>
+      <w:r>
+        <w:rPr>
+          <w:rFonts w:ascii="Consolas" w:eastAsia="Times New Roman" w:hAnsi="Consolas" w:cs="Times New Roman"/>
+          <w:color w:val="1F2328"/>
+          <w:kern w:val="0"/>
+          <w:sz w:val="21"/>
+          <w:szCs w:val="21"/>
+          <w14:ligatures w14:val="none"/>
+        </w:rPr>
+        <w:t>);</w:t>
+      </w:r>
+    </w:p>
+    <w:p>
+      <w:pPr>
+        <w:shd w:val="clear" w:color="auto" w:fill="FFFFFF"/>
+        <w:spacing w:after="0" w:line="285" w:lineRule="atLeast"/>
+        <w:rPr>
+          <w:rFonts w:ascii="Consolas" w:eastAsia="Times New Roman" w:hAnsi="Consolas" w:cs="Times New Roman"/>
+          <w:color w:val="202020"/>
+          <w:kern w:val="0"/>
+          <w:sz w:val="21"/>
+          <w:szCs w:val="21"/>
+          <w14:ligatures w14:val="none"/>
+        </w:rPr>
+      </w:pPr>
+      <w:r>
+        <w:rPr>
+          <w:rFonts w:ascii="Consolas" w:eastAsia="Times New Roman" w:hAnsi="Consolas" w:cs="Times New Roman"/>
+          <w:color w:val="1F2328"/>
+          <w:kern w:val="0"/>
+          <w:sz w:val="21"/>
+          <w:szCs w:val="21"/>
+          <w14:ligatures w14:val="none"/>
+        </w:rPr>
+        <w:t xml:space="preserve">            </w:t>
+      </w:r>
+      <w:r>
+        <w:rPr>
+          <w:rFonts w:ascii="Consolas" w:eastAsia="Times New Roman" w:hAnsi="Consolas" w:cs="Times New Roman"/>
+          <w:color w:val="CF222E"/>
+          <w:kern w:val="0"/>
+          <w:sz w:val="21"/>
+          <w:szCs w:val="21"/>
+          <w14:ligatures w14:val="none"/>
+        </w:rPr>
+        <w:t>const</w:t>
+      </w:r>
+      <w:r>
+        <w:rPr>
+          <w:rFonts w:ascii="Consolas" w:eastAsia="Times New Roman" w:hAnsi="Consolas" w:cs="Times New Roman"/>
+          <w:color w:val="1F2328"/>
+          <w:kern w:val="0"/>
+          <w:sz w:val="21"/>
+          <w:szCs w:val="21"/>
+          <w14:ligatures w14:val="none"/>
+        </w:rPr>
+        <w:t xml:space="preserve"> </w:t>
+      </w:r>
+      <w:r>
+        <w:rPr>
+          <w:rFonts w:ascii="Consolas" w:eastAsia="Times New Roman" w:hAnsi="Consolas" w:cs="Times New Roman"/>
+          <w:color w:val="0550AE"/>
+          <w:kern w:val="0"/>
+          <w:sz w:val="21"/>
+          <w:szCs w:val="21"/>
+          <w14:ligatures w14:val="none"/>
+        </w:rPr>
+        <w:t>t2</w:t>
+      </w:r>
+      <w:r>
+        <w:rPr>
+          <w:rFonts w:ascii="Consolas" w:eastAsia="Times New Roman" w:hAnsi="Consolas" w:cs="Times New Roman"/>
+          <w:color w:val="1F2328"/>
+          <w:kern w:val="0"/>
+          <w:sz w:val="21"/>
+          <w:szCs w:val="21"/>
+          <w14:ligatures w14:val="none"/>
+        </w:rPr>
+        <w:t xml:space="preserve"> </w:t>
+      </w:r>
+      <w:r>
+        <w:rPr>
+          <w:rFonts w:ascii="Consolas" w:eastAsia="Times New Roman" w:hAnsi="Consolas" w:cs="Times New Roman"/>
+          <w:color w:val="000000"/>
+          <w:kern w:val="0"/>
+          <w:sz w:val="21"/>
+          <w:szCs w:val="21"/>
+          <w14:ligatures w14:val="none"/>
+        </w:rPr>
+        <w:t>=</w:t>
+      </w:r>
+      <w:r>
+        <w:rPr>
+          <w:rFonts w:ascii="Consolas" w:eastAsia="Times New Roman" w:hAnsi="Consolas" w:cs="Times New Roman"/>
+          <w:color w:val="1F2328"/>
+          <w:kern w:val="0"/>
+          <w:sz w:val="21"/>
+          <w:szCs w:val="21"/>
+          <w14:ligatures w14:val="none"/>
+        </w:rPr>
+        <w:t xml:space="preserve"> </w:t>
+      </w:r>
+      <w:r>
+        <w:rPr>
+          <w:rFonts w:ascii="Consolas" w:eastAsia="Times New Roman" w:hAnsi="Consolas" w:cs="Times New Roman"/>
+          <w:color w:val="0550AE"/>
+          <w:kern w:val="0"/>
+          <w:sz w:val="21"/>
+          <w:szCs w:val="21"/>
+          <w14:ligatures w14:val="none"/>
+        </w:rPr>
+        <w:t>t</w:t>
+      </w:r>
+      <w:proofErr w:type="gramStart"/>
+      <w:r>
+        <w:rPr>
+          <w:rFonts w:ascii="Consolas" w:eastAsia="Times New Roman" w:hAnsi="Consolas" w:cs="Times New Roman"/>
+          <w:color w:val="0550AE"/>
+          <w:kern w:val="0"/>
+          <w:sz w:val="21"/>
+          <w:szCs w:val="21"/>
+          <w14:ligatures w14:val="none"/>
+        </w:rPr>
+        <w:t>1</w:t>
+      </w:r>
+      <w:r>
+        <w:rPr>
+          <w:rFonts w:ascii="Consolas" w:eastAsia="Times New Roman" w:hAnsi="Consolas" w:cs="Times New Roman"/>
+          <w:color w:val="1F2328"/>
+          <w:kern w:val="0"/>
+          <w:sz w:val="21"/>
+          <w:szCs w:val="21"/>
+          <w14:ligatures w14:val="none"/>
+        </w:rPr>
+        <w:t xml:space="preserve"> </w:t>
+      </w:r>
+      <w:r>
+        <w:rPr>
+          <w:rFonts w:ascii="Consolas" w:eastAsia="Times New Roman" w:hAnsi="Consolas" w:cs="Times New Roman"/>
+          <w:color w:val="000000"/>
+          <w:kern w:val="0"/>
+          <w:sz w:val="21"/>
+          <w:szCs w:val="21"/>
+          <w14:ligatures w14:val="none"/>
+        </w:rPr>
+        <w:t>?</w:t>
+      </w:r>
+      <w:proofErr w:type="gramEnd"/>
+      <w:r>
+        <w:rPr>
+          <w:rFonts w:ascii="Consolas" w:eastAsia="Times New Roman" w:hAnsi="Consolas" w:cs="Times New Roman"/>
+          <w:color w:val="1F2328"/>
+          <w:kern w:val="0"/>
+          <w:sz w:val="21"/>
+          <w:szCs w:val="21"/>
+          <w14:ligatures w14:val="none"/>
+        </w:rPr>
+        <w:t xml:space="preserve"> </w:t>
+      </w:r>
+      <w:r>
+        <w:rPr>
+          <w:rFonts w:ascii="Consolas" w:eastAsia="Times New Roman" w:hAnsi="Consolas" w:cs="Times New Roman"/>
+          <w:color w:val="0550AE"/>
+          <w:kern w:val="0"/>
+          <w:sz w:val="21"/>
+          <w:szCs w:val="21"/>
+          <w14:ligatures w14:val="none"/>
+        </w:rPr>
+        <w:t>JSON</w:t>
+      </w:r>
+      <w:r>
+        <w:rPr>
+          <w:rFonts w:ascii="Consolas" w:eastAsia="Times New Roman" w:hAnsi="Consolas" w:cs="Times New Roman"/>
+          <w:color w:val="1F2328"/>
+          <w:kern w:val="0"/>
+          <w:sz w:val="21"/>
+          <w:szCs w:val="21"/>
+          <w14:ligatures w14:val="none"/>
+        </w:rPr>
+        <w:t>.</w:t>
+      </w:r>
+      <w:r>
+        <w:rPr>
+          <w:rFonts w:ascii="Consolas" w:eastAsia="Times New Roman" w:hAnsi="Consolas" w:cs="Times New Roman"/>
+          <w:color w:val="8250DF"/>
+          <w:kern w:val="0"/>
+          <w:sz w:val="21"/>
+          <w:szCs w:val="21"/>
+          <w14:ligatures w14:val="none"/>
+        </w:rPr>
+        <w:t>parse</w:t>
+      </w:r>
+      <w:r>
+        <w:rPr>
+          <w:rFonts w:ascii="Consolas" w:eastAsia="Times New Roman" w:hAnsi="Consolas" w:cs="Times New Roman"/>
+          <w:color w:val="1F2328"/>
+          <w:kern w:val="0"/>
+          <w:sz w:val="21"/>
+          <w:szCs w:val="21"/>
+          <w14:ligatures w14:val="none"/>
+        </w:rPr>
+        <w:t>(</w:t>
+      </w:r>
+      <w:r>
+        <w:rPr>
+          <w:rFonts w:ascii="Consolas" w:eastAsia="Times New Roman" w:hAnsi="Consolas" w:cs="Times New Roman"/>
+          <w:color w:val="0550AE"/>
+          <w:kern w:val="0"/>
+          <w:sz w:val="21"/>
+          <w:szCs w:val="21"/>
+          <w14:ligatures w14:val="none"/>
+        </w:rPr>
+        <w:t>t1</w:t>
+      </w:r>
+      <w:proofErr w:type="gramStart"/>
+      <w:r>
+        <w:rPr>
+          <w:rFonts w:ascii="Consolas" w:eastAsia="Times New Roman" w:hAnsi="Consolas" w:cs="Times New Roman"/>
+          <w:color w:val="1F2328"/>
+          <w:kern w:val="0"/>
+          <w:sz w:val="21"/>
+          <w:szCs w:val="21"/>
+          <w14:ligatures w14:val="none"/>
+        </w:rPr>
+        <w:t xml:space="preserve">) </w:t>
+      </w:r>
+      <w:r>
+        <w:rPr>
+          <w:rFonts w:ascii="Consolas" w:eastAsia="Times New Roman" w:hAnsi="Consolas" w:cs="Times New Roman"/>
+          <w:color w:val="000000"/>
+          <w:kern w:val="0"/>
+          <w:sz w:val="21"/>
+          <w:szCs w:val="21"/>
+          <w14:ligatures w14:val="none"/>
+        </w:rPr>
+        <w:t>:</w:t>
+      </w:r>
+      <w:proofErr w:type="gramEnd"/>
+      <w:r>
+        <w:rPr>
+          <w:rFonts w:ascii="Consolas" w:eastAsia="Times New Roman" w:hAnsi="Consolas" w:cs="Times New Roman"/>
+          <w:color w:val="1F2328"/>
+          <w:kern w:val="0"/>
+          <w:sz w:val="21"/>
+          <w:szCs w:val="21"/>
+          <w14:ligatures w14:val="none"/>
+        </w:rPr>
+        <w:t xml:space="preserve"> </w:t>
+      </w:r>
+      <w:r>
+        <w:rPr>
+          <w:rFonts w:ascii="Consolas" w:eastAsia="Times New Roman" w:hAnsi="Consolas" w:cs="Times New Roman"/>
+          <w:color w:val="0000FF"/>
+          <w:kern w:val="0"/>
+          <w:sz w:val="21"/>
+          <w:szCs w:val="21"/>
+          <w14:ligatures w14:val="none"/>
+        </w:rPr>
+        <w:t>null</w:t>
+      </w:r>
+      <w:r>
+        <w:rPr>
+          <w:rFonts w:ascii="Consolas" w:eastAsia="Times New Roman" w:hAnsi="Consolas" w:cs="Times New Roman"/>
+          <w:color w:val="1F2328"/>
+          <w:kern w:val="0"/>
+          <w:sz w:val="21"/>
+          <w:szCs w:val="21"/>
+          <w14:ligatures w14:val="none"/>
+        </w:rPr>
+        <w:t>;</w:t>
+      </w:r>
+    </w:p>
+    <w:p>
+      <w:pPr>
+        <w:shd w:val="clear" w:color="auto" w:fill="FFFFFF"/>
+        <w:spacing w:after="0" w:line="285" w:lineRule="atLeast"/>
+        <w:rPr>
+          <w:rFonts w:ascii="Consolas" w:eastAsia="Times New Roman" w:hAnsi="Consolas" w:cs="Times New Roman"/>
+          <w:color w:val="202020"/>
+          <w:kern w:val="0"/>
+          <w:sz w:val="21"/>
+          <w:szCs w:val="21"/>
+          <w14:ligatures w14:val="none"/>
+        </w:rPr>
+      </w:pPr>
+    </w:p>
+    <w:p>
+      <w:pPr>
+        <w:shd w:val="clear" w:color="auto" w:fill="FFFFFF"/>
+        <w:spacing w:after="0" w:line="285" w:lineRule="atLeast"/>
+        <w:rPr>
+          <w:rFonts w:ascii="Consolas" w:eastAsia="Times New Roman" w:hAnsi="Consolas" w:cs="Times New Roman"/>
+          <w:color w:val="202020"/>
+          <w:kern w:val="0"/>
+          <w:sz w:val="21"/>
+          <w:szCs w:val="21"/>
+          <w14:ligatures w14:val="none"/>
+        </w:rPr>
+      </w:pPr>
+      <w:r>
+        <w:rPr>
+          <w:rFonts w:ascii="Consolas" w:eastAsia="Times New Roman" w:hAnsi="Consolas" w:cs="Times New Roman"/>
+          <w:color w:val="1F2328"/>
+          <w:kern w:val="0"/>
+          <w:sz w:val="21"/>
+          <w:szCs w:val="21"/>
+          <w14:ligatures w14:val="none"/>
+        </w:rPr>
+        <w:t xml:space="preserve">            </w:t>
+      </w:r>
+      <w:r>
+        <w:rPr>
+          <w:rFonts w:ascii="Consolas" w:eastAsia="Times New Roman" w:hAnsi="Consolas" w:cs="Times New Roman"/>
+          <w:color w:val="AF00DB"/>
+          <w:kern w:val="0"/>
+          <w:sz w:val="21"/>
+          <w:szCs w:val="21"/>
+          <w14:ligatures w14:val="none"/>
+        </w:rPr>
+        <w:t>if</w:t>
+      </w:r>
+      <w:r>
+        <w:rPr>
+          <w:rFonts w:ascii="Consolas" w:eastAsia="Times New Roman" w:hAnsi="Consolas" w:cs="Times New Roman"/>
+          <w:color w:val="1F2328"/>
+          <w:kern w:val="0"/>
+          <w:sz w:val="21"/>
+          <w:szCs w:val="21"/>
+          <w14:ligatures w14:val="none"/>
+        </w:rPr>
+        <w:t xml:space="preserve"> (</w:t>
+      </w:r>
+      <w:r>
+        <w:rPr>
+          <w:rFonts w:ascii="Consolas" w:eastAsia="Times New Roman" w:hAnsi="Consolas" w:cs="Times New Roman"/>
+          <w:color w:val="0550AE"/>
+          <w:kern w:val="0"/>
+          <w:sz w:val="21"/>
+          <w:szCs w:val="21"/>
+          <w14:ligatures w14:val="none"/>
+        </w:rPr>
+        <w:t>t2</w:t>
+      </w:r>
+      <w:proofErr w:type="gramStart"/>
+      <w:r>
+        <w:rPr>
+          <w:rFonts w:ascii="Consolas" w:eastAsia="Times New Roman" w:hAnsi="Consolas" w:cs="Times New Roman"/>
+          <w:color w:val="1F2328"/>
+          <w:kern w:val="0"/>
+          <w:sz w:val="21"/>
+          <w:szCs w:val="21"/>
+          <w14:ligatures w14:val="none"/>
+        </w:rPr>
+        <w:t>?._</w:t>
+      </w:r>
+      <w:proofErr w:type="gramEnd"/>
+      <w:r>
+        <w:rPr>
+          <w:rFonts w:ascii="Consolas" w:eastAsia="Times New Roman" w:hAnsi="Consolas" w:cs="Times New Roman"/>
+          <w:color w:val="1F2328"/>
+          <w:kern w:val="0"/>
+          <w:sz w:val="21"/>
+          <w:szCs w:val="21"/>
+          <w14:ligatures w14:val="none"/>
+        </w:rPr>
+        <w:t xml:space="preserve">id </w:t>
+      </w:r>
+      <w:r>
+        <w:rPr>
+          <w:rFonts w:ascii="Consolas" w:eastAsia="Times New Roman" w:hAnsi="Consolas" w:cs="Times New Roman"/>
+          <w:color w:val="000000"/>
+          <w:kern w:val="0"/>
+          <w:sz w:val="21"/>
+          <w:szCs w:val="21"/>
+          <w14:ligatures w14:val="none"/>
+        </w:rPr>
+        <w:t>===</w:t>
+      </w:r>
+      <w:r>
+        <w:rPr>
+          <w:rFonts w:ascii="Consolas" w:eastAsia="Times New Roman" w:hAnsi="Consolas" w:cs="Times New Roman"/>
+          <w:color w:val="1F2328"/>
+          <w:kern w:val="0"/>
+          <w:sz w:val="21"/>
+          <w:szCs w:val="21"/>
+          <w14:ligatures w14:val="none"/>
+        </w:rPr>
+        <w:t xml:space="preserve"> </w:t>
+      </w:r>
+      <w:r>
+        <w:rPr>
+          <w:rFonts w:ascii="Consolas" w:eastAsia="Times New Roman" w:hAnsi="Consolas" w:cs="Times New Roman"/>
+          <w:color w:val="953800"/>
+          <w:kern w:val="0"/>
+          <w:sz w:val="21"/>
+          <w:szCs w:val="21"/>
+          <w14:ligatures w14:val="none"/>
+        </w:rPr>
+        <w:t>message</w:t>
+      </w:r>
+      <w:proofErr w:type="gramStart"/>
+      <w:r>
+        <w:rPr>
+          <w:rFonts w:ascii="Consolas" w:eastAsia="Times New Roman" w:hAnsi="Consolas" w:cs="Times New Roman"/>
+          <w:color w:val="1F2328"/>
+          <w:kern w:val="0"/>
+          <w:sz w:val="21"/>
+          <w:szCs w:val="21"/>
+          <w14:ligatures w14:val="none"/>
+        </w:rPr>
+        <w:t>?.chat</w:t>
+      </w:r>
+      <w:proofErr w:type="gramEnd"/>
+      <w:r>
+        <w:rPr>
+          <w:rFonts w:ascii="Consolas" w:eastAsia="Times New Roman" w:hAnsi="Consolas" w:cs="Times New Roman"/>
+          <w:color w:val="1F2328"/>
+          <w:kern w:val="0"/>
+          <w:sz w:val="21"/>
+          <w:szCs w:val="21"/>
+          <w14:ligatures w14:val="none"/>
+        </w:rPr>
+        <w:t>?._id) {</w:t>
+      </w:r>
+    </w:p>
+    <w:p>
+      <w:pPr>
+        <w:shd w:val="clear" w:color="auto" w:fill="FFFFFF"/>
+        <w:spacing w:after="0" w:line="285" w:lineRule="atLeast"/>
+        <w:rPr>
+          <w:rFonts w:ascii="Consolas" w:eastAsia="Times New Roman" w:hAnsi="Consolas" w:cs="Times New Roman"/>
+          <w:color w:val="202020"/>
+          <w:kern w:val="0"/>
+          <w:sz w:val="21"/>
+          <w:szCs w:val="21"/>
+          <w14:ligatures w14:val="none"/>
+        </w:rPr>
+      </w:pPr>
+      <w:r>
+        <w:rPr>
+          <w:rFonts w:ascii="Consolas" w:eastAsia="Times New Roman" w:hAnsi="Consolas" w:cs="Times New Roman"/>
+          <w:color w:val="1F2328"/>
+          <w:kern w:val="0"/>
+          <w:sz w:val="21"/>
+          <w:szCs w:val="21"/>
+          <w14:ligatures w14:val="none"/>
+        </w:rPr>
+        <w:t xml:space="preserve">                </w:t>
+      </w:r>
+      <w:r>
+        <w:rPr>
+          <w:rFonts w:ascii="Consolas" w:eastAsia="Times New Roman" w:hAnsi="Consolas" w:cs="Times New Roman"/>
+          <w:color w:val="AF00DB"/>
+          <w:kern w:val="0"/>
+          <w:sz w:val="21"/>
+          <w:szCs w:val="21"/>
+          <w14:ligatures w14:val="none"/>
+        </w:rPr>
+        <w:t>if</w:t>
+      </w:r>
+      <w:r>
+        <w:rPr>
+          <w:rFonts w:ascii="Consolas" w:eastAsia="Times New Roman" w:hAnsi="Consolas" w:cs="Times New Roman"/>
+          <w:color w:val="1F2328"/>
+          <w:kern w:val="0"/>
+          <w:sz w:val="21"/>
+          <w:szCs w:val="21"/>
+          <w14:ligatures w14:val="none"/>
+        </w:rPr>
+        <w:t xml:space="preserve"> </w:t>
+      </w:r>
+      <w:proofErr w:type="gramStart"/>
+      <w:r>
+        <w:rPr>
+          <w:rFonts w:ascii="Consolas" w:eastAsia="Times New Roman" w:hAnsi="Consolas" w:cs="Times New Roman"/>
+          <w:color w:val="1F2328"/>
+          <w:kern w:val="0"/>
+          <w:sz w:val="21"/>
+          <w:szCs w:val="21"/>
+          <w14:ligatures w14:val="none"/>
+        </w:rPr>
+        <w:t>(</w:t>
+      </w:r>
+      <w:r>
+        <w:rPr>
+          <w:rFonts w:ascii="Consolas" w:eastAsia="Times New Roman" w:hAnsi="Consolas" w:cs="Times New Roman"/>
+          <w:color w:val="000000"/>
+          <w:kern w:val="0"/>
+          <w:sz w:val="21"/>
+          <w:szCs w:val="21"/>
+          <w14:ligatures w14:val="none"/>
+        </w:rPr>
+        <w:t>!</w:t>
+      </w:r>
+      <w:r>
+        <w:rPr>
+          <w:rFonts w:ascii="Consolas" w:eastAsia="Times New Roman" w:hAnsi="Consolas" w:cs="Times New Roman"/>
+          <w:color w:val="0550AE"/>
+          <w:kern w:val="0"/>
+          <w:sz w:val="21"/>
+          <w:szCs w:val="21"/>
+          <w14:ligatures w14:val="none"/>
+        </w:rPr>
+        <w:t>messages</w:t>
+      </w:r>
+      <w:proofErr w:type="gramEnd"/>
+      <w:r>
+        <w:rPr>
+          <w:rFonts w:ascii="Consolas" w:eastAsia="Times New Roman" w:hAnsi="Consolas" w:cs="Times New Roman"/>
+          <w:color w:val="1F2328"/>
+          <w:kern w:val="0"/>
+          <w:sz w:val="21"/>
+          <w:szCs w:val="21"/>
+          <w14:ligatures w14:val="none"/>
+        </w:rPr>
+        <w:t>) {</w:t>
+      </w:r>
+    </w:p>
+    <w:p>
+      <w:pPr>
+        <w:shd w:val="clear" w:color="auto" w:fill="FFFFFF"/>
+        <w:spacing w:after="0" w:line="285" w:lineRule="atLeast"/>
+        <w:rPr>
+          <w:rFonts w:ascii="Consolas" w:eastAsia="Times New Roman" w:hAnsi="Consolas" w:cs="Times New Roman"/>
+          <w:color w:val="202020"/>
+          <w:kern w:val="0"/>
+          <w:sz w:val="21"/>
+          <w:szCs w:val="21"/>
+          <w14:ligatures w14:val="none"/>
+        </w:rPr>
+      </w:pPr>
+      <w:r>
+        <w:rPr>
+          <w:rFonts w:ascii="Consolas" w:eastAsia="Times New Roman" w:hAnsi="Consolas" w:cs="Times New Roman"/>
+          <w:color w:val="1F2328"/>
+          <w:kern w:val="0"/>
+          <w:sz w:val="21"/>
+          <w:szCs w:val="21"/>
+          <w14:ligatures w14:val="none"/>
+        </w:rPr>
+        <w:t xml:space="preserve">                    </w:t>
+      </w:r>
+      <w:r>
+        <w:rPr>
+          <w:rFonts w:ascii="Consolas" w:eastAsia="Times New Roman" w:hAnsi="Consolas" w:cs="Times New Roman"/>
+          <w:color w:val="8250DF"/>
+          <w:kern w:val="0"/>
+          <w:sz w:val="21"/>
+          <w:szCs w:val="21"/>
+          <w14:ligatures w14:val="none"/>
+        </w:rPr>
+        <w:t>setMessages</w:t>
+      </w:r>
+      <w:r>
+        <w:rPr>
+          <w:rFonts w:ascii="Consolas" w:eastAsia="Times New Roman" w:hAnsi="Consolas" w:cs="Times New Roman"/>
+          <w:color w:val="1F2328"/>
+          <w:kern w:val="0"/>
+          <w:sz w:val="21"/>
+          <w:szCs w:val="21"/>
+          <w14:ligatures w14:val="none"/>
+        </w:rPr>
+        <w:t>([</w:t>
+      </w:r>
+      <w:r>
+        <w:rPr>
+          <w:rFonts w:ascii="Consolas" w:eastAsia="Times New Roman" w:hAnsi="Consolas" w:cs="Times New Roman"/>
+          <w:color w:val="953800"/>
+          <w:kern w:val="0"/>
+          <w:sz w:val="21"/>
+          <w:szCs w:val="21"/>
+          <w14:ligatures w14:val="none"/>
+        </w:rPr>
+        <w:t>message</w:t>
+      </w:r>
+      <w:r>
+        <w:rPr>
+          <w:rFonts w:ascii="Consolas" w:eastAsia="Times New Roman" w:hAnsi="Consolas" w:cs="Times New Roman"/>
+          <w:color w:val="1F2328"/>
+          <w:kern w:val="0"/>
+          <w:sz w:val="21"/>
+          <w:szCs w:val="21"/>
+          <w14:ligatures w14:val="none"/>
+        </w:rPr>
+        <w:t>]);</w:t>
+      </w:r>
+    </w:p>
+    <w:p>
+      <w:pPr>
+        <w:shd w:val="clear" w:color="auto" w:fill="FFFFFF"/>
+        <w:spacing w:after="0" w:line="285" w:lineRule="atLeast"/>
+        <w:rPr>
+          <w:rFonts w:ascii="Consolas" w:eastAsia="Times New Roman" w:hAnsi="Consolas" w:cs="Times New Roman"/>
+          <w:color w:val="202020"/>
+          <w:kern w:val="0"/>
+          <w:sz w:val="21"/>
+          <w:szCs w:val="21"/>
+          <w14:ligatures w14:val="none"/>
+        </w:rPr>
+      </w:pPr>
+      <w:r>
+        <w:rPr>
+          <w:rFonts w:ascii="Consolas" w:eastAsia="Times New Roman" w:hAnsi="Consolas" w:cs="Times New Roman"/>
+          <w:color w:val="1F2328"/>
+          <w:kern w:val="0"/>
+          <w:sz w:val="21"/>
+          <w:szCs w:val="21"/>
+          <w14:ligatures w14:val="none"/>
+        </w:rPr>
+        <w:t xml:space="preserve">                } </w:t>
+      </w:r>
+      <w:r>
+        <w:rPr>
+          <w:rFonts w:ascii="Consolas" w:eastAsia="Times New Roman" w:hAnsi="Consolas" w:cs="Times New Roman"/>
+          <w:color w:val="AF00DB"/>
+          <w:kern w:val="0"/>
+          <w:sz w:val="21"/>
+          <w:szCs w:val="21"/>
+          <w14:ligatures w14:val="none"/>
+        </w:rPr>
+        <w:t>else</w:t>
+      </w:r>
+      <w:r>
+        <w:rPr>
+          <w:rFonts w:ascii="Consolas" w:eastAsia="Times New Roman" w:hAnsi="Consolas" w:cs="Times New Roman"/>
+          <w:color w:val="1F2328"/>
+          <w:kern w:val="0"/>
+          <w:sz w:val="21"/>
+          <w:szCs w:val="21"/>
+          <w14:ligatures w14:val="none"/>
+        </w:rPr>
+        <w:t xml:space="preserve"> {</w:t>
+      </w:r>
+    </w:p>
+    <w:p>
+      <w:pPr>
+        <w:shd w:val="clear" w:color="auto" w:fill="FFFFFF"/>
+        <w:spacing w:after="0" w:line="285" w:lineRule="atLeast"/>
+        <w:rPr>
+          <w:rFonts w:ascii="Consolas" w:eastAsia="Times New Roman" w:hAnsi="Consolas" w:cs="Times New Roman"/>
+          <w:color w:val="202020"/>
+          <w:kern w:val="0"/>
+          <w:sz w:val="21"/>
+          <w:szCs w:val="21"/>
+          <w14:ligatures w14:val="none"/>
+        </w:rPr>
+      </w:pPr>
+      <w:r>
+        <w:rPr>
+          <w:rFonts w:ascii="Consolas" w:eastAsia="Times New Roman" w:hAnsi="Consolas" w:cs="Times New Roman"/>
+          <w:color w:val="1F2328"/>
+          <w:kern w:val="0"/>
+          <w:sz w:val="21"/>
+          <w:szCs w:val="21"/>
+          <w14:ligatures w14:val="none"/>
+        </w:rPr>
+        <w:t xml:space="preserve">                    </w:t>
+      </w:r>
+      <w:proofErr w:type="gramStart"/>
+      <w:r>
+        <w:rPr>
+          <w:rFonts w:ascii="Consolas" w:eastAsia="Times New Roman" w:hAnsi="Consolas" w:cs="Times New Roman"/>
+          <w:color w:val="8250DF"/>
+          <w:kern w:val="0"/>
+          <w:sz w:val="21"/>
+          <w:szCs w:val="21"/>
+          <w14:ligatures w14:val="none"/>
+        </w:rPr>
+        <w:t>setMessages</w:t>
+      </w:r>
+      <w:r>
+        <w:rPr>
+          <w:rFonts w:ascii="Consolas" w:eastAsia="Times New Roman" w:hAnsi="Consolas" w:cs="Times New Roman"/>
+          <w:color w:val="1F2328"/>
+          <w:kern w:val="0"/>
+          <w:sz w:val="21"/>
+          <w:szCs w:val="21"/>
+          <w14:ligatures w14:val="none"/>
+        </w:rPr>
+        <w:t>(</w:t>
+      </w:r>
+      <w:proofErr w:type="gramEnd"/>
+      <w:r>
+        <w:rPr>
+          <w:rFonts w:ascii="Consolas" w:eastAsia="Times New Roman" w:hAnsi="Consolas" w:cs="Times New Roman"/>
+          <w:color w:val="1F2328"/>
+          <w:kern w:val="0"/>
+          <w:sz w:val="21"/>
+          <w:szCs w:val="21"/>
+          <w14:ligatures w14:val="none"/>
+        </w:rPr>
+        <w:t>(</w:t>
+      </w:r>
+      <w:r>
+        <w:rPr>
+          <w:rFonts w:ascii="Consolas" w:eastAsia="Times New Roman" w:hAnsi="Consolas" w:cs="Times New Roman"/>
+          <w:color w:val="953800"/>
+          <w:kern w:val="0"/>
+          <w:sz w:val="21"/>
+          <w:szCs w:val="21"/>
+          <w14:ligatures w14:val="none"/>
+        </w:rPr>
+        <w:t>prev</w:t>
+      </w:r>
+      <w:r>
+        <w:rPr>
+          <w:rFonts w:ascii="Consolas" w:eastAsia="Times New Roman" w:hAnsi="Consolas" w:cs="Times New Roman"/>
+          <w:color w:val="000000"/>
+          <w:kern w:val="0"/>
+          <w:sz w:val="21"/>
+          <w:szCs w:val="21"/>
+          <w14:ligatures w14:val="none"/>
+        </w:rPr>
+        <w:t>:</w:t>
+      </w:r>
+      <w:r>
+        <w:rPr>
+          <w:rFonts w:ascii="Consolas" w:eastAsia="Times New Roman" w:hAnsi="Consolas" w:cs="Times New Roman"/>
+          <w:color w:val="1F2328"/>
+          <w:kern w:val="0"/>
+          <w:sz w:val="21"/>
+          <w:szCs w:val="21"/>
+          <w14:ligatures w14:val="none"/>
+        </w:rPr>
+        <w:t xml:space="preserve"> </w:t>
+      </w:r>
+      <w:proofErr w:type="gramStart"/>
+      <w:r>
+        <w:rPr>
+          <w:rFonts w:ascii="Consolas" w:eastAsia="Times New Roman" w:hAnsi="Consolas" w:cs="Times New Roman"/>
+          <w:color w:val="267F99"/>
+          <w:kern w:val="0"/>
+          <w:sz w:val="21"/>
+          <w:szCs w:val="21"/>
+          <w14:ligatures w14:val="none"/>
+        </w:rPr>
+        <w:t>Message</w:t>
+      </w:r>
+      <w:r>
+        <w:rPr>
+          <w:rFonts w:ascii="Consolas" w:eastAsia="Times New Roman" w:hAnsi="Consolas" w:cs="Times New Roman"/>
+          <w:color w:val="1F2328"/>
+          <w:kern w:val="0"/>
+          <w:sz w:val="21"/>
+          <w:szCs w:val="21"/>
+          <w14:ligatures w14:val="none"/>
+        </w:rPr>
+        <w:t>[</w:t>
+      </w:r>
+      <w:proofErr w:type="gramEnd"/>
+      <w:r>
+        <w:rPr>
+          <w:rFonts w:ascii="Consolas" w:eastAsia="Times New Roman" w:hAnsi="Consolas" w:cs="Times New Roman"/>
+          <w:color w:val="1F2328"/>
+          <w:kern w:val="0"/>
+          <w:sz w:val="21"/>
+          <w:szCs w:val="21"/>
+          <w14:ligatures w14:val="none"/>
+        </w:rPr>
+        <w:t xml:space="preserve">]) </w:t>
+      </w:r>
+      <w:r>
+        <w:rPr>
+          <w:rFonts w:ascii="Consolas" w:eastAsia="Times New Roman" w:hAnsi="Consolas" w:cs="Times New Roman"/>
+          <w:color w:val="CF222E"/>
+          <w:kern w:val="0"/>
+          <w:sz w:val="21"/>
+          <w:szCs w:val="21"/>
+          <w14:ligatures w14:val="none"/>
+        </w:rPr>
+        <w:t>=&gt;</w:t>
+      </w:r>
+      <w:r>
+        <w:rPr>
+          <w:rFonts w:ascii="Consolas" w:eastAsia="Times New Roman" w:hAnsi="Consolas" w:cs="Times New Roman"/>
+          <w:color w:val="1F2328"/>
+          <w:kern w:val="0"/>
+          <w:sz w:val="21"/>
+          <w:szCs w:val="21"/>
+          <w14:ligatures w14:val="none"/>
+        </w:rPr>
+        <w:t xml:space="preserve"> [</w:t>
+      </w:r>
+      <w:r>
+        <w:rPr>
+          <w:rFonts w:ascii="Consolas" w:eastAsia="Times New Roman" w:hAnsi="Consolas" w:cs="Times New Roman"/>
+          <w:color w:val="000000"/>
+          <w:kern w:val="0"/>
+          <w:sz w:val="21"/>
+          <w:szCs w:val="21"/>
+          <w14:ligatures w14:val="none"/>
+        </w:rPr>
+        <w:t>...</w:t>
+      </w:r>
+      <w:r>
+        <w:rPr>
+          <w:rFonts w:ascii="Consolas" w:eastAsia="Times New Roman" w:hAnsi="Consolas" w:cs="Times New Roman"/>
+          <w:color w:val="953800"/>
+          <w:kern w:val="0"/>
+          <w:sz w:val="21"/>
+          <w:szCs w:val="21"/>
+          <w14:ligatures w14:val="none"/>
+        </w:rPr>
+        <w:t>prev</w:t>
+      </w:r>
+      <w:r>
+        <w:rPr>
+          <w:rFonts w:ascii="Consolas" w:eastAsia="Times New Roman" w:hAnsi="Consolas" w:cs="Times New Roman"/>
+          <w:color w:val="1F2328"/>
+          <w:kern w:val="0"/>
+          <w:sz w:val="21"/>
+          <w:szCs w:val="21"/>
+          <w14:ligatures w14:val="none"/>
+        </w:rPr>
+        <w:t xml:space="preserve">, </w:t>
+      </w:r>
+      <w:r>
+        <w:rPr>
+          <w:rFonts w:ascii="Consolas" w:eastAsia="Times New Roman" w:hAnsi="Consolas" w:cs="Times New Roman"/>
+          <w:color w:val="953800"/>
+          <w:kern w:val="0"/>
+          <w:sz w:val="21"/>
+          <w:szCs w:val="21"/>
+          <w14:ligatures w14:val="none"/>
+        </w:rPr>
+        <w:t>message</w:t>
+      </w:r>
+      <w:r>
+        <w:rPr>
+          <w:rFonts w:ascii="Consolas" w:eastAsia="Times New Roman" w:hAnsi="Consolas" w:cs="Times New Roman"/>
+          <w:color w:val="1F2328"/>
+          <w:kern w:val="0"/>
+          <w:sz w:val="21"/>
+          <w:szCs w:val="21"/>
+          <w14:ligatures w14:val="none"/>
+        </w:rPr>
+        <w:t>]);</w:t>
+      </w:r>
+    </w:p>
+    <w:p>
+      <w:pPr>
+        <w:shd w:val="clear" w:color="auto" w:fill="FFFFFF"/>
+        <w:spacing w:after="0" w:line="285" w:lineRule="atLeast"/>
+        <w:rPr>
+          <w:rFonts w:ascii="Consolas" w:eastAsia="Times New Roman" w:hAnsi="Consolas" w:cs="Times New Roman"/>
+          <w:color w:val="202020"/>
+          <w:kern w:val="0"/>
+          <w:sz w:val="21"/>
+          <w:szCs w:val="21"/>
+          <w14:ligatures w14:val="none"/>
+        </w:rPr>
+      </w:pPr>
+      <w:r>
+        <w:rPr>
+          <w:rFonts w:ascii="Consolas" w:eastAsia="Times New Roman" w:hAnsi="Consolas" w:cs="Times New Roman"/>
+          <w:color w:val="1F2328"/>
+          <w:kern w:val="0"/>
+          <w:sz w:val="21"/>
+          <w:szCs w:val="21"/>
+          <w14:ligatures w14:val="none"/>
+        </w:rPr>
+        <w:t>                }</w:t>
+      </w:r>
+    </w:p>
+    <w:p>
+      <w:pPr>
+        <w:shd w:val="clear" w:color="auto" w:fill="FFFFFF"/>
+        <w:spacing w:after="0" w:line="285" w:lineRule="atLeast"/>
+        <w:rPr>
+          <w:rFonts w:ascii="Consolas" w:eastAsia="Times New Roman" w:hAnsi="Consolas" w:cs="Times New Roman"/>
+          <w:color w:val="202020"/>
+          <w:kern w:val="0"/>
+          <w:sz w:val="21"/>
+          <w:szCs w:val="21"/>
+          <w14:ligatures w14:val="none"/>
+        </w:rPr>
+      </w:pPr>
+      <w:r>
+        <w:rPr>
+          <w:rFonts w:ascii="Consolas" w:eastAsia="Times New Roman" w:hAnsi="Consolas" w:cs="Times New Roman"/>
+          <w:color w:val="1F2328"/>
+          <w:kern w:val="0"/>
+          <w:sz w:val="21"/>
+          <w:szCs w:val="21"/>
+          <w14:ligatures w14:val="none"/>
+        </w:rPr>
+        <w:t>            }</w:t>
+      </w:r>
+    </w:p>
+    <w:p>
+      <w:pPr>
+        <w:shd w:val="clear" w:color="auto" w:fill="FFFFFF"/>
+        <w:spacing w:after="0" w:line="285" w:lineRule="atLeast"/>
+        <w:rPr>
+          <w:rFonts w:ascii="Consolas" w:eastAsia="Times New Roman" w:hAnsi="Consolas" w:cs="Times New Roman"/>
+          <w:color w:val="202020"/>
+          <w:kern w:val="0"/>
+          <w:sz w:val="21"/>
+          <w:szCs w:val="21"/>
+          <w14:ligatures w14:val="none"/>
+        </w:rPr>
+      </w:pPr>
+      <w:r>
+        <w:rPr>
+          <w:rFonts w:ascii="Consolas" w:eastAsia="Times New Roman" w:hAnsi="Consolas" w:cs="Times New Roman"/>
+          <w:color w:val="1F2328"/>
+          <w:kern w:val="0"/>
+          <w:sz w:val="21"/>
+          <w:szCs w:val="21"/>
+          <w14:ligatures w14:val="none"/>
+        </w:rPr>
+        <w:t>        });</w:t>
+      </w:r>
+    </w:p>
+    <w:p>
+      <w:pPr>
+        <w:ind w:left="1440" w:firstLine="720"/>
+        <w:rPr>
+          <w:rFonts w:ascii="Sakkal Majalla" w:eastAsia="Times New Roman" w:hAnsi="Sakkal Majalla" w:cs="Sakkal Majalla"/>
+          <w:color w:val="202020"/>
+          <w:kern w:val="0"/>
+          <w14:ligatures w14:val="none"/>
+        </w:rPr>
+      </w:pPr>
+      <w:r>
+        <w:rPr>
+          <w:rFonts w:ascii="Sakkal Majalla" w:eastAsia="Times New Roman" w:hAnsi="Sakkal Majalla" w:cs="Sakkal Majalla"/>
+          <w:color w:val="202020"/>
+          <w:kern w:val="0"/>
+          <w14:ligatures w14:val="none"/>
+        </w:rPr>
+        <w:t>======================================================</w:t>
+      </w:r>
+    </w:p>
+    <w:p>
+      <w:pPr>
+        <w:shd w:val="clear" w:color="auto" w:fill="FFFFFF"/>
+        <w:spacing w:after="0" w:line="285" w:lineRule="atLeast"/>
+        <w:rPr>
           <w:rFonts w:ascii="Sakkal Majalla" w:eastAsia="Times New Roman" w:hAnsi="Sakkal Majalla" w:cs="Sakkal Majalla" w:hint="cs"/>
           <w:color w:val="202020"/>
           <w:kern w:val="0"/>
           <w14:ligatures w14:val="none"/>
         </w:rPr>
       </w:pPr>
-    </w:p>
-    <w:p>
-      <w:pPr>
-        <w:rPr>
-          <w:rFonts w:ascii="Sakkal Majalla" w:hAnsi="Sakkal Majalla" w:cs="Sakkal Majalla" w:hint="cs"/>
-        </w:rPr>
-      </w:pPr>
+      <w:r>
+        <w:rPr>
+          <w:rFonts w:ascii="Sakkal Majalla" w:eastAsia="Times New Roman" w:hAnsi="Sakkal Majalla" w:cs="Sakkal Majalla" w:hint="cs"/>
+          <w:color w:val="202020"/>
+          <w:kern w:val="0"/>
+          <w14:ligatures w14:val="none"/>
+        </w:rPr>
+        <w:t>To send an event from the client to the server, we can use emit-method:</w:t>
+      </w:r>
+    </w:p>
+    <w:p>
+      <w:pPr>
+        <w:shd w:val="clear" w:color="auto" w:fill="FFFFFF"/>
+        <w:spacing w:after="0" w:line="285" w:lineRule="atLeast"/>
+        <w:rPr>
+          <w:rFonts w:ascii="Consolas" w:eastAsia="Times New Roman" w:hAnsi="Consolas" w:cs="Times New Roman"/>
+          <w:color w:val="202020"/>
+          <w:kern w:val="0"/>
+          <w:sz w:val="21"/>
+          <w:szCs w:val="21"/>
+          <w14:ligatures w14:val="none"/>
+        </w:rPr>
+      </w:pPr>
+      <w:r>
+        <w:rPr>
+          <w:rFonts w:ascii="Consolas" w:eastAsia="Times New Roman" w:hAnsi="Consolas" w:cs="Times New Roman"/>
+          <w:color w:val="1F2328"/>
+          <w:kern w:val="0"/>
+          <w:sz w:val="21"/>
+          <w:szCs w:val="21"/>
+          <w14:ligatures w14:val="none"/>
+        </w:rPr>
+        <w:t xml:space="preserve">    </w:t>
+      </w:r>
+      <w:proofErr w:type="gramStart"/>
+      <w:r>
+        <w:rPr>
+          <w:rFonts w:ascii="Consolas" w:eastAsia="Times New Roman" w:hAnsi="Consolas" w:cs="Times New Roman"/>
+          <w:color w:val="8250DF"/>
+          <w:kern w:val="0"/>
+          <w:sz w:val="21"/>
+          <w:szCs w:val="21"/>
+          <w14:ligatures w14:val="none"/>
+        </w:rPr>
+        <w:t>useEffect</w:t>
+      </w:r>
+      <w:r>
+        <w:rPr>
+          <w:rFonts w:ascii="Consolas" w:eastAsia="Times New Roman" w:hAnsi="Consolas" w:cs="Times New Roman"/>
+          <w:color w:val="1F2328"/>
+          <w:kern w:val="0"/>
+          <w:sz w:val="21"/>
+          <w:szCs w:val="21"/>
+          <w14:ligatures w14:val="none"/>
+        </w:rPr>
+        <w:t>(</w:t>
+      </w:r>
+      <w:proofErr w:type="gramEnd"/>
+      <w:r>
+        <w:rPr>
+          <w:rFonts w:ascii="Consolas" w:eastAsia="Times New Roman" w:hAnsi="Consolas" w:cs="Times New Roman"/>
+          <w:color w:val="1F2328"/>
+          <w:kern w:val="0"/>
+          <w:sz w:val="21"/>
+          <w:szCs w:val="21"/>
+          <w14:ligatures w14:val="none"/>
+        </w:rPr>
+        <w:t xml:space="preserve">() </w:t>
+      </w:r>
+      <w:r>
+        <w:rPr>
+          <w:rFonts w:ascii="Consolas" w:eastAsia="Times New Roman" w:hAnsi="Consolas" w:cs="Times New Roman"/>
+          <w:color w:val="CF222E"/>
+          <w:kern w:val="0"/>
+          <w:sz w:val="21"/>
+          <w:szCs w:val="21"/>
+          <w14:ligatures w14:val="none"/>
+        </w:rPr>
+        <w:t>=&gt;</w:t>
+      </w:r>
+      <w:r>
+        <w:rPr>
+          <w:rFonts w:ascii="Consolas" w:eastAsia="Times New Roman" w:hAnsi="Consolas" w:cs="Times New Roman"/>
+          <w:color w:val="1F2328"/>
+          <w:kern w:val="0"/>
+          <w:sz w:val="21"/>
+          <w:szCs w:val="21"/>
+          <w14:ligatures w14:val="none"/>
+        </w:rPr>
+        <w:t xml:space="preserve"> {</w:t>
+      </w:r>
+    </w:p>
+    <w:p>
+      <w:pPr>
+        <w:shd w:val="clear" w:color="auto" w:fill="FFFFFF"/>
+        <w:spacing w:after="0" w:line="285" w:lineRule="atLeast"/>
+        <w:rPr>
+          <w:rFonts w:ascii="Consolas" w:eastAsia="Times New Roman" w:hAnsi="Consolas" w:cs="Times New Roman"/>
+          <w:color w:val="202020"/>
+          <w:kern w:val="0"/>
+          <w:sz w:val="21"/>
+          <w:szCs w:val="21"/>
+          <w14:ligatures w14:val="none"/>
+        </w:rPr>
+      </w:pPr>
+      <w:r>
+        <w:rPr>
+          <w:rFonts w:ascii="Consolas" w:eastAsia="Times New Roman" w:hAnsi="Consolas" w:cs="Times New Roman"/>
+          <w:color w:val="1F2328"/>
+          <w:kern w:val="0"/>
+          <w:sz w:val="21"/>
+          <w:szCs w:val="21"/>
+          <w14:ligatures w14:val="none"/>
+        </w:rPr>
+        <w:t xml:space="preserve">        </w:t>
+      </w:r>
+      <w:r>
+        <w:rPr>
+          <w:rFonts w:ascii="Consolas" w:eastAsia="Times New Roman" w:hAnsi="Consolas" w:cs="Times New Roman"/>
+          <w:color w:val="AF00DB"/>
+          <w:kern w:val="0"/>
+          <w:sz w:val="21"/>
+          <w:szCs w:val="21"/>
+          <w14:ligatures w14:val="none"/>
+        </w:rPr>
+        <w:t>if</w:t>
+      </w:r>
+      <w:r>
+        <w:rPr>
+          <w:rFonts w:ascii="Consolas" w:eastAsia="Times New Roman" w:hAnsi="Consolas" w:cs="Times New Roman"/>
+          <w:color w:val="1F2328"/>
+          <w:kern w:val="0"/>
+          <w:sz w:val="21"/>
+          <w:szCs w:val="21"/>
+          <w14:ligatures w14:val="none"/>
+        </w:rPr>
+        <w:t xml:space="preserve"> (</w:t>
+      </w:r>
+      <w:r>
+        <w:rPr>
+          <w:rFonts w:ascii="Consolas" w:eastAsia="Times New Roman" w:hAnsi="Consolas" w:cs="Times New Roman"/>
+          <w:color w:val="0550AE"/>
+          <w:kern w:val="0"/>
+          <w:sz w:val="21"/>
+          <w:szCs w:val="21"/>
+          <w14:ligatures w14:val="none"/>
+        </w:rPr>
+        <w:t>socket</w:t>
+      </w:r>
+      <w:r>
+        <w:rPr>
+          <w:rFonts w:ascii="Consolas" w:eastAsia="Times New Roman" w:hAnsi="Consolas" w:cs="Times New Roman"/>
+          <w:color w:val="1F2328"/>
+          <w:kern w:val="0"/>
+          <w:sz w:val="21"/>
+          <w:szCs w:val="21"/>
+          <w14:ligatures w14:val="none"/>
+        </w:rPr>
+        <w:t>) {</w:t>
+      </w:r>
+    </w:p>
+    <w:p>
+      <w:pPr>
+        <w:shd w:val="clear" w:color="auto" w:fill="FFFFFF"/>
+        <w:spacing w:after="0" w:line="285" w:lineRule="atLeast"/>
+        <w:rPr>
+          <w:rFonts w:ascii="Consolas" w:eastAsia="Times New Roman" w:hAnsi="Consolas" w:cs="Times New Roman"/>
+          <w:color w:val="202020"/>
+          <w:kern w:val="0"/>
+          <w:sz w:val="21"/>
+          <w:szCs w:val="21"/>
+          <w14:ligatures w14:val="none"/>
+        </w:rPr>
+      </w:pPr>
+      <w:r>
+        <w:rPr>
+          <w:rFonts w:ascii="Consolas" w:eastAsia="Times New Roman" w:hAnsi="Consolas" w:cs="Times New Roman"/>
+          <w:color w:val="1F2328"/>
+          <w:kern w:val="0"/>
+          <w:sz w:val="21"/>
+          <w:szCs w:val="21"/>
+          <w14:ligatures w14:val="none"/>
+        </w:rPr>
+        <w:t xml:space="preserve">            </w:t>
+      </w:r>
+      <w:r>
+        <w:rPr>
+          <w:rFonts w:ascii="Consolas" w:eastAsia="Times New Roman" w:hAnsi="Consolas" w:cs="Times New Roman"/>
+          <w:color w:val="CF222E"/>
+          <w:kern w:val="0"/>
+          <w:sz w:val="21"/>
+          <w:szCs w:val="21"/>
+          <w14:ligatures w14:val="none"/>
+        </w:rPr>
+        <w:t>let</w:t>
+      </w:r>
+      <w:r>
+        <w:rPr>
+          <w:rFonts w:ascii="Consolas" w:eastAsia="Times New Roman" w:hAnsi="Consolas" w:cs="Times New Roman"/>
+          <w:color w:val="1F2328"/>
+          <w:kern w:val="0"/>
+          <w:sz w:val="21"/>
+          <w:szCs w:val="21"/>
+          <w14:ligatures w14:val="none"/>
+        </w:rPr>
+        <w:t xml:space="preserve"> recipient </w:t>
+      </w:r>
+      <w:r>
+        <w:rPr>
+          <w:rFonts w:ascii="Consolas" w:eastAsia="Times New Roman" w:hAnsi="Consolas" w:cs="Times New Roman"/>
+          <w:color w:val="000000"/>
+          <w:kern w:val="0"/>
+          <w:sz w:val="21"/>
+          <w:szCs w:val="21"/>
+          <w14:ligatures w14:val="none"/>
+        </w:rPr>
+        <w:t>=</w:t>
+      </w:r>
+      <w:r>
+        <w:rPr>
+          <w:rFonts w:ascii="Consolas" w:eastAsia="Times New Roman" w:hAnsi="Consolas" w:cs="Times New Roman"/>
+          <w:color w:val="1F2328"/>
+          <w:kern w:val="0"/>
+          <w:sz w:val="21"/>
+          <w:szCs w:val="21"/>
+          <w14:ligatures w14:val="none"/>
+        </w:rPr>
+        <w:t xml:space="preserve"> </w:t>
+      </w:r>
+      <w:r>
+        <w:rPr>
+          <w:rFonts w:ascii="Consolas" w:eastAsia="Times New Roman" w:hAnsi="Consolas" w:cs="Times New Roman"/>
+          <w:color w:val="0550AE"/>
+          <w:kern w:val="0"/>
+          <w:sz w:val="21"/>
+          <w:szCs w:val="21"/>
+          <w14:ligatures w14:val="none"/>
+        </w:rPr>
+        <w:t>currentChat</w:t>
+      </w:r>
+      <w:proofErr w:type="gramStart"/>
+      <w:r>
+        <w:rPr>
+          <w:rFonts w:ascii="Consolas" w:eastAsia="Times New Roman" w:hAnsi="Consolas" w:cs="Times New Roman"/>
+          <w:color w:val="1F2328"/>
+          <w:kern w:val="0"/>
+          <w:sz w:val="21"/>
+          <w:szCs w:val="21"/>
+          <w14:ligatures w14:val="none"/>
+        </w:rPr>
+        <w:t>?.members</w:t>
+      </w:r>
+      <w:proofErr w:type="gramEnd"/>
+      <w:r>
+        <w:rPr>
+          <w:rFonts w:ascii="Consolas" w:eastAsia="Times New Roman" w:hAnsi="Consolas" w:cs="Times New Roman"/>
+          <w:color w:val="1F2328"/>
+          <w:kern w:val="0"/>
+          <w:sz w:val="21"/>
+          <w:szCs w:val="21"/>
+          <w14:ligatures w14:val="none"/>
+        </w:rPr>
+        <w:t>.</w:t>
+      </w:r>
+      <w:proofErr w:type="gramStart"/>
+      <w:r>
+        <w:rPr>
+          <w:rFonts w:ascii="Consolas" w:eastAsia="Times New Roman" w:hAnsi="Consolas" w:cs="Times New Roman"/>
+          <w:color w:val="8250DF"/>
+          <w:kern w:val="0"/>
+          <w:sz w:val="21"/>
+          <w:szCs w:val="21"/>
+          <w14:ligatures w14:val="none"/>
+        </w:rPr>
+        <w:t>find</w:t>
+      </w:r>
+      <w:r>
+        <w:rPr>
+          <w:rFonts w:ascii="Consolas" w:eastAsia="Times New Roman" w:hAnsi="Consolas" w:cs="Times New Roman"/>
+          <w:color w:val="1F2328"/>
+          <w:kern w:val="0"/>
+          <w:sz w:val="21"/>
+          <w:szCs w:val="21"/>
+          <w14:ligatures w14:val="none"/>
+        </w:rPr>
+        <w:t>(</w:t>
+      </w:r>
+      <w:proofErr w:type="gramEnd"/>
+      <w:r>
+        <w:rPr>
+          <w:rFonts w:ascii="Consolas" w:eastAsia="Times New Roman" w:hAnsi="Consolas" w:cs="Times New Roman"/>
+          <w:color w:val="953800"/>
+          <w:kern w:val="0"/>
+          <w:sz w:val="21"/>
+          <w:szCs w:val="21"/>
+          <w14:ligatures w14:val="none"/>
+        </w:rPr>
+        <w:t>t1</w:t>
+      </w:r>
+      <w:r>
+        <w:rPr>
+          <w:rFonts w:ascii="Consolas" w:eastAsia="Times New Roman" w:hAnsi="Consolas" w:cs="Times New Roman"/>
+          <w:color w:val="1F2328"/>
+          <w:kern w:val="0"/>
+          <w:sz w:val="21"/>
+          <w:szCs w:val="21"/>
+          <w14:ligatures w14:val="none"/>
+        </w:rPr>
+        <w:t xml:space="preserve"> </w:t>
+      </w:r>
+      <w:r>
+        <w:rPr>
+          <w:rFonts w:ascii="Consolas" w:eastAsia="Times New Roman" w:hAnsi="Consolas" w:cs="Times New Roman"/>
+          <w:color w:val="CF222E"/>
+          <w:kern w:val="0"/>
+          <w:sz w:val="21"/>
+          <w:szCs w:val="21"/>
+          <w14:ligatures w14:val="none"/>
+        </w:rPr>
+        <w:t>=&gt;</w:t>
+      </w:r>
+      <w:r>
+        <w:rPr>
+          <w:rFonts w:ascii="Consolas" w:eastAsia="Times New Roman" w:hAnsi="Consolas" w:cs="Times New Roman"/>
+          <w:color w:val="1F2328"/>
+          <w:kern w:val="0"/>
+          <w:sz w:val="21"/>
+          <w:szCs w:val="21"/>
+          <w14:ligatures w14:val="none"/>
+        </w:rPr>
+        <w:t xml:space="preserve"> </w:t>
+      </w:r>
+      <w:r>
+        <w:rPr>
+          <w:rFonts w:ascii="Consolas" w:eastAsia="Times New Roman" w:hAnsi="Consolas" w:cs="Times New Roman"/>
+          <w:color w:val="953800"/>
+          <w:kern w:val="0"/>
+          <w:sz w:val="21"/>
+          <w:szCs w:val="21"/>
+          <w14:ligatures w14:val="none"/>
+        </w:rPr>
+        <w:t>t</w:t>
+      </w:r>
+      <w:proofErr w:type="gramStart"/>
+      <w:r>
+        <w:rPr>
+          <w:rFonts w:ascii="Consolas" w:eastAsia="Times New Roman" w:hAnsi="Consolas" w:cs="Times New Roman"/>
+          <w:color w:val="953800"/>
+          <w:kern w:val="0"/>
+          <w:sz w:val="21"/>
+          <w:szCs w:val="21"/>
+          <w14:ligatures w14:val="none"/>
+        </w:rPr>
+        <w:t>1</w:t>
+      </w:r>
+      <w:r>
+        <w:rPr>
+          <w:rFonts w:ascii="Consolas" w:eastAsia="Times New Roman" w:hAnsi="Consolas" w:cs="Times New Roman"/>
+          <w:color w:val="1F2328"/>
+          <w:kern w:val="0"/>
+          <w:sz w:val="21"/>
+          <w:szCs w:val="21"/>
+          <w14:ligatures w14:val="none"/>
+        </w:rPr>
+        <w:t xml:space="preserve">._id </w:t>
+      </w:r>
+      <w:r>
+        <w:rPr>
+          <w:rFonts w:ascii="Consolas" w:eastAsia="Times New Roman" w:hAnsi="Consolas" w:cs="Times New Roman"/>
+          <w:color w:val="000000"/>
+          <w:kern w:val="0"/>
+          <w:sz w:val="21"/>
+          <w:szCs w:val="21"/>
+          <w14:ligatures w14:val="none"/>
+        </w:rPr>
+        <w:t>!</w:t>
+      </w:r>
+      <w:proofErr w:type="gramEnd"/>
+      <w:r>
+        <w:rPr>
+          <w:rFonts w:ascii="Consolas" w:eastAsia="Times New Roman" w:hAnsi="Consolas" w:cs="Times New Roman"/>
+          <w:color w:val="000000"/>
+          <w:kern w:val="0"/>
+          <w:sz w:val="21"/>
+          <w:szCs w:val="21"/>
+          <w14:ligatures w14:val="none"/>
+        </w:rPr>
+        <w:t>==</w:t>
+      </w:r>
+      <w:r>
+        <w:rPr>
+          <w:rFonts w:ascii="Consolas" w:eastAsia="Times New Roman" w:hAnsi="Consolas" w:cs="Times New Roman"/>
+          <w:color w:val="1F2328"/>
+          <w:kern w:val="0"/>
+          <w:sz w:val="21"/>
+          <w:szCs w:val="21"/>
+          <w14:ligatures w14:val="none"/>
+        </w:rPr>
+        <w:t xml:space="preserve"> </w:t>
+      </w:r>
+      <w:r>
+        <w:rPr>
+          <w:rFonts w:ascii="Consolas" w:eastAsia="Times New Roman" w:hAnsi="Consolas" w:cs="Times New Roman"/>
+          <w:color w:val="953800"/>
+          <w:kern w:val="0"/>
+          <w:sz w:val="21"/>
+          <w:szCs w:val="21"/>
+          <w14:ligatures w14:val="none"/>
+        </w:rPr>
+        <w:t>user</w:t>
+      </w:r>
+      <w:r>
+        <w:rPr>
+          <w:rFonts w:ascii="Consolas" w:eastAsia="Times New Roman" w:hAnsi="Consolas" w:cs="Times New Roman"/>
+          <w:color w:val="1F2328"/>
+          <w:kern w:val="0"/>
+          <w:sz w:val="21"/>
+          <w:szCs w:val="21"/>
+          <w14:ligatures w14:val="none"/>
+        </w:rPr>
+        <w:t>._id);</w:t>
+      </w:r>
+    </w:p>
+    <w:p>
+      <w:pPr>
+        <w:shd w:val="clear" w:color="auto" w:fill="FFFFFF"/>
+        <w:spacing w:after="0" w:line="285" w:lineRule="atLeast"/>
+        <w:rPr>
+          <w:rFonts w:ascii="Consolas" w:eastAsia="Times New Roman" w:hAnsi="Consolas" w:cs="Times New Roman"/>
+          <w:color w:val="202020"/>
+          <w:kern w:val="0"/>
+          <w:sz w:val="21"/>
+          <w:szCs w:val="21"/>
+          <w14:ligatures w14:val="none"/>
+        </w:rPr>
+      </w:pPr>
+      <w:r>
+        <w:rPr>
+          <w:rFonts w:ascii="Consolas" w:eastAsia="Times New Roman" w:hAnsi="Consolas" w:cs="Times New Roman"/>
+          <w:color w:val="1F2328"/>
+          <w:kern w:val="0"/>
+          <w:sz w:val="21"/>
+          <w:szCs w:val="21"/>
+          <w14:ligatures w14:val="none"/>
+        </w:rPr>
+        <w:t xml:space="preserve">            </w:t>
+      </w:r>
+      <w:r>
+        <w:rPr>
+          <w:rFonts w:ascii="Consolas" w:eastAsia="Times New Roman" w:hAnsi="Consolas" w:cs="Times New Roman"/>
+          <w:color w:val="AF00DB"/>
+          <w:kern w:val="0"/>
+          <w:sz w:val="21"/>
+          <w:szCs w:val="21"/>
+          <w14:ligatures w14:val="none"/>
+        </w:rPr>
+        <w:t>if</w:t>
+      </w:r>
+      <w:r>
+        <w:rPr>
+          <w:rFonts w:ascii="Consolas" w:eastAsia="Times New Roman" w:hAnsi="Consolas" w:cs="Times New Roman"/>
+          <w:color w:val="1F2328"/>
+          <w:kern w:val="0"/>
+          <w:sz w:val="21"/>
+          <w:szCs w:val="21"/>
+          <w14:ligatures w14:val="none"/>
+        </w:rPr>
+        <w:t xml:space="preserve"> </w:t>
+      </w:r>
+      <w:proofErr w:type="gramStart"/>
+      <w:r>
+        <w:rPr>
+          <w:rFonts w:ascii="Consolas" w:eastAsia="Times New Roman" w:hAnsi="Consolas" w:cs="Times New Roman"/>
+          <w:color w:val="1F2328"/>
+          <w:kern w:val="0"/>
+          <w:sz w:val="21"/>
+          <w:szCs w:val="21"/>
+          <w14:ligatures w14:val="none"/>
+        </w:rPr>
+        <w:t>(</w:t>
+      </w:r>
+      <w:r>
+        <w:rPr>
+          <w:rFonts w:ascii="Consolas" w:eastAsia="Times New Roman" w:hAnsi="Consolas" w:cs="Times New Roman"/>
+          <w:color w:val="000000"/>
+          <w:kern w:val="0"/>
+          <w:sz w:val="21"/>
+          <w:szCs w:val="21"/>
+          <w14:ligatures w14:val="none"/>
+        </w:rPr>
+        <w:t>!</w:t>
+      </w:r>
+      <w:r>
+        <w:rPr>
+          <w:rFonts w:ascii="Consolas" w:eastAsia="Times New Roman" w:hAnsi="Consolas" w:cs="Times New Roman"/>
+          <w:color w:val="1F2328"/>
+          <w:kern w:val="0"/>
+          <w:sz w:val="21"/>
+          <w:szCs w:val="21"/>
+          <w14:ligatures w14:val="none"/>
+        </w:rPr>
+        <w:t>recipient</w:t>
+      </w:r>
+      <w:proofErr w:type="gramEnd"/>
+      <w:r>
+        <w:rPr>
+          <w:rFonts w:ascii="Consolas" w:eastAsia="Times New Roman" w:hAnsi="Consolas" w:cs="Times New Roman"/>
+          <w:color w:val="1F2328"/>
+          <w:kern w:val="0"/>
+          <w:sz w:val="21"/>
+          <w:szCs w:val="21"/>
+          <w14:ligatures w14:val="none"/>
+        </w:rPr>
+        <w:t xml:space="preserve">) </w:t>
+      </w:r>
+      <w:r>
+        <w:rPr>
+          <w:rFonts w:ascii="Consolas" w:eastAsia="Times New Roman" w:hAnsi="Consolas" w:cs="Times New Roman"/>
+          <w:color w:val="AF00DB"/>
+          <w:kern w:val="0"/>
+          <w:sz w:val="21"/>
+          <w:szCs w:val="21"/>
+          <w14:ligatures w14:val="none"/>
+        </w:rPr>
+        <w:t>return</w:t>
+      </w:r>
+      <w:r>
+        <w:rPr>
+          <w:rFonts w:ascii="Consolas" w:eastAsia="Times New Roman" w:hAnsi="Consolas" w:cs="Times New Roman"/>
+          <w:color w:val="1F2328"/>
+          <w:kern w:val="0"/>
+          <w:sz w:val="21"/>
+          <w:szCs w:val="21"/>
+          <w14:ligatures w14:val="none"/>
+        </w:rPr>
+        <w:t xml:space="preserve"> </w:t>
+      </w:r>
+      <w:proofErr w:type="gramStart"/>
+      <w:r>
+        <w:rPr>
+          <w:rFonts w:ascii="Consolas" w:eastAsia="Times New Roman" w:hAnsi="Consolas" w:cs="Times New Roman"/>
+          <w:color w:val="0550AE"/>
+          <w:kern w:val="0"/>
+          <w:sz w:val="21"/>
+          <w:szCs w:val="21"/>
+          <w14:ligatures w14:val="none"/>
+        </w:rPr>
+        <w:t>console</w:t>
+      </w:r>
+      <w:r>
+        <w:rPr>
+          <w:rFonts w:ascii="Consolas" w:eastAsia="Times New Roman" w:hAnsi="Consolas" w:cs="Times New Roman"/>
+          <w:color w:val="1F2328"/>
+          <w:kern w:val="0"/>
+          <w:sz w:val="21"/>
+          <w:szCs w:val="21"/>
+          <w14:ligatures w14:val="none"/>
+        </w:rPr>
+        <w:t>.</w:t>
+      </w:r>
+      <w:r>
+        <w:rPr>
+          <w:rFonts w:ascii="Consolas" w:eastAsia="Times New Roman" w:hAnsi="Consolas" w:cs="Times New Roman"/>
+          <w:color w:val="8250DF"/>
+          <w:kern w:val="0"/>
+          <w:sz w:val="21"/>
+          <w:szCs w:val="21"/>
+          <w14:ligatures w14:val="none"/>
+        </w:rPr>
+        <w:t>log</w:t>
+      </w:r>
+      <w:r>
+        <w:rPr>
+          <w:rFonts w:ascii="Consolas" w:eastAsia="Times New Roman" w:hAnsi="Consolas" w:cs="Times New Roman"/>
+          <w:color w:val="1F2328"/>
+          <w:kern w:val="0"/>
+          <w:sz w:val="21"/>
+          <w:szCs w:val="21"/>
+          <w14:ligatures w14:val="none"/>
+        </w:rPr>
+        <w:t>(</w:t>
+      </w:r>
+      <w:proofErr w:type="gramEnd"/>
+      <w:r>
+        <w:rPr>
+          <w:rFonts w:ascii="Consolas" w:eastAsia="Times New Roman" w:hAnsi="Consolas" w:cs="Times New Roman"/>
+          <w:color w:val="0A3069"/>
+          <w:kern w:val="0"/>
+          <w:sz w:val="21"/>
+          <w:szCs w:val="21"/>
+          <w14:ligatures w14:val="none"/>
+        </w:rPr>
+        <w:t xml:space="preserve">"No Recipient Found </w:t>
+      </w:r>
+      <w:proofErr w:type="gramStart"/>
+      <w:r>
+        <w:rPr>
+          <w:rFonts w:ascii="Consolas" w:eastAsia="Times New Roman" w:hAnsi="Consolas" w:cs="Times New Roman"/>
+          <w:color w:val="0A3069"/>
+          <w:kern w:val="0"/>
+          <w:sz w:val="21"/>
+          <w:szCs w:val="21"/>
+          <w14:ligatures w14:val="none"/>
+        </w:rPr>
+        <w:t>For</w:t>
+      </w:r>
+      <w:proofErr w:type="gramEnd"/>
+      <w:r>
+        <w:rPr>
+          <w:rFonts w:ascii="Consolas" w:eastAsia="Times New Roman" w:hAnsi="Consolas" w:cs="Times New Roman"/>
+          <w:color w:val="0A3069"/>
+          <w:kern w:val="0"/>
+          <w:sz w:val="21"/>
+          <w:szCs w:val="21"/>
+          <w14:ligatures w14:val="none"/>
+        </w:rPr>
+        <w:t xml:space="preserve"> NewMessage: "</w:t>
+      </w:r>
+      <w:r>
+        <w:rPr>
+          <w:rFonts w:ascii="Consolas" w:eastAsia="Times New Roman" w:hAnsi="Consolas" w:cs="Times New Roman"/>
+          <w:color w:val="1F2328"/>
+          <w:kern w:val="0"/>
+          <w:sz w:val="21"/>
+          <w:szCs w:val="21"/>
+          <w14:ligatures w14:val="none"/>
+        </w:rPr>
+        <w:t xml:space="preserve">, </w:t>
+      </w:r>
+      <w:r>
+        <w:rPr>
+          <w:rFonts w:ascii="Consolas" w:eastAsia="Times New Roman" w:hAnsi="Consolas" w:cs="Times New Roman"/>
+          <w:color w:val="0550AE"/>
+          <w:kern w:val="0"/>
+          <w:sz w:val="21"/>
+          <w:szCs w:val="21"/>
+          <w14:ligatures w14:val="none"/>
+        </w:rPr>
+        <w:t>newMessage</w:t>
+      </w:r>
+      <w:r>
+        <w:rPr>
+          <w:rFonts w:ascii="Consolas" w:eastAsia="Times New Roman" w:hAnsi="Consolas" w:cs="Times New Roman"/>
+          <w:color w:val="1F2328"/>
+          <w:kern w:val="0"/>
+          <w:sz w:val="21"/>
+          <w:szCs w:val="21"/>
+          <w14:ligatures w14:val="none"/>
+        </w:rPr>
+        <w:t>);</w:t>
+      </w:r>
+    </w:p>
+    <w:p>
+      <w:pPr>
+        <w:shd w:val="clear" w:color="auto" w:fill="FFFFFF"/>
+        <w:spacing w:after="0" w:line="285" w:lineRule="atLeast"/>
+        <w:rPr>
+          <w:rFonts w:ascii="Consolas" w:eastAsia="Times New Roman" w:hAnsi="Consolas" w:cs="Times New Roman"/>
+          <w:color w:val="202020"/>
+          <w:kern w:val="0"/>
+          <w:sz w:val="21"/>
+          <w:szCs w:val="21"/>
+          <w14:ligatures w14:val="none"/>
+        </w:rPr>
+      </w:pPr>
+      <w:r>
+        <w:rPr>
+          <w:rFonts w:ascii="Consolas" w:eastAsia="Times New Roman" w:hAnsi="Consolas" w:cs="Times New Roman"/>
+          <w:color w:val="1F2328"/>
+          <w:kern w:val="0"/>
+          <w:sz w:val="21"/>
+          <w:szCs w:val="21"/>
+          <w14:ligatures w14:val="none"/>
+        </w:rPr>
+        <w:t xml:space="preserve">            </w:t>
+      </w:r>
+      <w:r>
+        <w:rPr>
+          <w:rFonts w:ascii="Consolas" w:eastAsia="Times New Roman" w:hAnsi="Consolas" w:cs="Times New Roman"/>
+          <w:color w:val="0550AE"/>
+          <w:kern w:val="0"/>
+          <w:sz w:val="21"/>
+          <w:szCs w:val="21"/>
+          <w14:ligatures w14:val="none"/>
+        </w:rPr>
+        <w:t>socket</w:t>
+      </w:r>
+      <w:r>
+        <w:rPr>
+          <w:rFonts w:ascii="Consolas" w:eastAsia="Times New Roman" w:hAnsi="Consolas" w:cs="Times New Roman"/>
+          <w:color w:val="1F2328"/>
+          <w:kern w:val="0"/>
+          <w:sz w:val="21"/>
+          <w:szCs w:val="21"/>
+          <w14:ligatures w14:val="none"/>
+        </w:rPr>
+        <w:t>.</w:t>
+      </w:r>
+      <w:r>
+        <w:rPr>
+          <w:rFonts w:ascii="Consolas" w:eastAsia="Times New Roman" w:hAnsi="Consolas" w:cs="Times New Roman"/>
+          <w:color w:val="8250DF"/>
+          <w:kern w:val="0"/>
+          <w:sz w:val="21"/>
+          <w:szCs w:val="21"/>
+          <w14:ligatures w14:val="none"/>
+        </w:rPr>
+        <w:t>emit</w:t>
+      </w:r>
+      <w:r>
+        <w:rPr>
+          <w:rFonts w:ascii="Consolas" w:eastAsia="Times New Roman" w:hAnsi="Consolas" w:cs="Times New Roman"/>
+          <w:color w:val="1F2328"/>
+          <w:kern w:val="0"/>
+          <w:sz w:val="21"/>
+          <w:szCs w:val="21"/>
+          <w14:ligatures w14:val="none"/>
+        </w:rPr>
+        <w:t>(</w:t>
+      </w:r>
+      <w:r>
+        <w:rPr>
+          <w:rFonts w:ascii="Consolas" w:eastAsia="Times New Roman" w:hAnsi="Consolas" w:cs="Times New Roman"/>
+          <w:color w:val="0A3069"/>
+          <w:kern w:val="0"/>
+          <w:sz w:val="21"/>
+          <w:szCs w:val="21"/>
+          <w14:ligatures w14:val="none"/>
+        </w:rPr>
+        <w:t>"addMessage"</w:t>
+      </w:r>
+      <w:r>
+        <w:rPr>
+          <w:rFonts w:ascii="Consolas" w:eastAsia="Times New Roman" w:hAnsi="Consolas" w:cs="Times New Roman"/>
+          <w:color w:val="1F2328"/>
+          <w:kern w:val="0"/>
+          <w:sz w:val="21"/>
+          <w:szCs w:val="21"/>
+          <w14:ligatures w14:val="none"/>
+        </w:rPr>
+        <w:t xml:space="preserve">, { </w:t>
+      </w:r>
+      <w:r>
+        <w:rPr>
+          <w:rFonts w:ascii="Consolas" w:eastAsia="Times New Roman" w:hAnsi="Consolas" w:cs="Times New Roman"/>
+          <w:color w:val="000000"/>
+          <w:kern w:val="0"/>
+          <w:sz w:val="21"/>
+          <w:szCs w:val="21"/>
+          <w14:ligatures w14:val="none"/>
+        </w:rPr>
+        <w:t>...</w:t>
+      </w:r>
+      <w:r>
+        <w:rPr>
+          <w:rFonts w:ascii="Consolas" w:eastAsia="Times New Roman" w:hAnsi="Consolas" w:cs="Times New Roman"/>
+          <w:color w:val="0550AE"/>
+          <w:kern w:val="0"/>
+          <w:sz w:val="21"/>
+          <w:szCs w:val="21"/>
+          <w14:ligatures w14:val="none"/>
+        </w:rPr>
+        <w:t>newMessage</w:t>
+      </w:r>
+      <w:r>
+        <w:rPr>
+          <w:rFonts w:ascii="Consolas" w:eastAsia="Times New Roman" w:hAnsi="Consolas" w:cs="Times New Roman"/>
+          <w:color w:val="1F2328"/>
+          <w:kern w:val="0"/>
+          <w:sz w:val="21"/>
+          <w:szCs w:val="21"/>
+          <w14:ligatures w14:val="none"/>
+        </w:rPr>
+        <w:t>, recipientId</w:t>
+      </w:r>
+      <w:r>
+        <w:rPr>
+          <w:rFonts w:ascii="Consolas" w:eastAsia="Times New Roman" w:hAnsi="Consolas" w:cs="Times New Roman"/>
+          <w:color w:val="001080"/>
+          <w:kern w:val="0"/>
+          <w:sz w:val="21"/>
+          <w:szCs w:val="21"/>
+          <w14:ligatures w14:val="none"/>
+        </w:rPr>
+        <w:t>:</w:t>
+      </w:r>
+      <w:r>
+        <w:rPr>
+          <w:rFonts w:ascii="Consolas" w:eastAsia="Times New Roman" w:hAnsi="Consolas" w:cs="Times New Roman"/>
+          <w:color w:val="1F2328"/>
+          <w:kern w:val="0"/>
+          <w:sz w:val="21"/>
+          <w:szCs w:val="21"/>
+          <w14:ligatures w14:val="none"/>
+        </w:rPr>
+        <w:t xml:space="preserve"> </w:t>
+      </w:r>
+      <w:proofErr w:type="gramStart"/>
+      <w:r>
+        <w:rPr>
+          <w:rFonts w:ascii="Consolas" w:eastAsia="Times New Roman" w:hAnsi="Consolas" w:cs="Times New Roman"/>
+          <w:color w:val="1F2328"/>
+          <w:kern w:val="0"/>
+          <w:sz w:val="21"/>
+          <w:szCs w:val="21"/>
+          <w14:ligatures w14:val="none"/>
+        </w:rPr>
+        <w:t>recipient._id }</w:t>
+      </w:r>
+      <w:proofErr w:type="gramEnd"/>
+      <w:r>
+        <w:rPr>
+          <w:rFonts w:ascii="Consolas" w:eastAsia="Times New Roman" w:hAnsi="Consolas" w:cs="Times New Roman"/>
+          <w:color w:val="1F2328"/>
+          <w:kern w:val="0"/>
+          <w:sz w:val="21"/>
+          <w:szCs w:val="21"/>
+          <w14:ligatures w14:val="none"/>
+        </w:rPr>
+        <w:t>);</w:t>
+      </w:r>
+    </w:p>
+    <w:p>
+      <w:pPr>
+        <w:shd w:val="clear" w:color="auto" w:fill="FFFFFF"/>
+        <w:spacing w:after="0" w:line="285" w:lineRule="atLeast"/>
+        <w:rPr>
+          <w:rFonts w:ascii="Consolas" w:eastAsia="Times New Roman" w:hAnsi="Consolas" w:cs="Times New Roman"/>
+          <w:color w:val="202020"/>
+          <w:kern w:val="0"/>
+          <w:sz w:val="21"/>
+          <w:szCs w:val="21"/>
+          <w14:ligatures w14:val="none"/>
+        </w:rPr>
+      </w:pPr>
+      <w:r>
+        <w:rPr>
+          <w:rFonts w:ascii="Consolas" w:eastAsia="Times New Roman" w:hAnsi="Consolas" w:cs="Times New Roman"/>
+          <w:color w:val="1F2328"/>
+          <w:kern w:val="0"/>
+          <w:sz w:val="21"/>
+          <w:szCs w:val="21"/>
+          <w14:ligatures w14:val="none"/>
+        </w:rPr>
+        <w:t>        }</w:t>
+      </w:r>
+    </w:p>
+    <w:p>
+      <w:pPr>
+        <w:shd w:val="clear" w:color="auto" w:fill="FFFFFF"/>
+        <w:spacing w:after="0" w:line="285" w:lineRule="atLeast"/>
+        <w:rPr>
+          <w:rFonts w:ascii="Consolas" w:eastAsia="Times New Roman" w:hAnsi="Consolas" w:cs="Times New Roman"/>
+          <w:color w:val="202020"/>
+          <w:kern w:val="0"/>
+          <w:sz w:val="21"/>
+          <w:szCs w:val="21"/>
+          <w14:ligatures w14:val="none"/>
+        </w:rPr>
+      </w:pPr>
+      <w:r>
+        <w:rPr>
+          <w:rFonts w:ascii="Consolas" w:eastAsia="Times New Roman" w:hAnsi="Consolas" w:cs="Times New Roman"/>
+          <w:color w:val="1F2328"/>
+          <w:kern w:val="0"/>
+          <w:sz w:val="21"/>
+          <w:szCs w:val="21"/>
+          <w14:ligatures w14:val="none"/>
+        </w:rPr>
+        <w:t>    }, [</w:t>
+      </w:r>
+      <w:r>
+        <w:rPr>
+          <w:rFonts w:ascii="Consolas" w:eastAsia="Times New Roman" w:hAnsi="Consolas" w:cs="Times New Roman"/>
+          <w:color w:val="0550AE"/>
+          <w:kern w:val="0"/>
+          <w:sz w:val="21"/>
+          <w:szCs w:val="21"/>
+          <w14:ligatures w14:val="none"/>
+        </w:rPr>
+        <w:t>newMessage</w:t>
+      </w:r>
+      <w:r>
+        <w:rPr>
+          <w:rFonts w:ascii="Consolas" w:eastAsia="Times New Roman" w:hAnsi="Consolas" w:cs="Times New Roman"/>
+          <w:color w:val="1F2328"/>
+          <w:kern w:val="0"/>
+          <w:sz w:val="21"/>
+          <w:szCs w:val="21"/>
+          <w14:ligatures w14:val="none"/>
+        </w:rPr>
+        <w:t>]);</w:t>
+      </w:r>
+    </w:p>
+    <w:p>
+      <w:pPr>
+        <w:ind w:left="1440" w:firstLine="720"/>
+        <w:rPr>
+          <w:rFonts w:ascii="Sakkal Majalla" w:eastAsia="Times New Roman" w:hAnsi="Sakkal Majalla" w:cs="Sakkal Majalla" w:hint="cs"/>
+          <w:color w:val="202020"/>
+          <w:kern w:val="0"/>
+          <w14:ligatures w14:val="none"/>
+        </w:rPr>
+      </w:pPr>
+      <w:r>
+        <w:rPr>
+          <w:rFonts w:ascii="Sakkal Majalla" w:eastAsia="Times New Roman" w:hAnsi="Sakkal Majalla" w:cs="Sakkal Majalla"/>
+          <w:color w:val="202020"/>
+          <w:kern w:val="0"/>
+          <w14:ligatures w14:val="none"/>
+        </w:rPr>
+        <w:t>======================================================</w:t>
+      </w:r>
     </w:p>
     <w:sectPr>
       <w:pgSz w:w="12240" w:h="15840"/>
@@ -4285,6 +8065,7 @@
   <w:style w:type="paragraph" w:default="1" w:styleId="Normal">
     <w:name w:val="Normal"/>
     <w:qFormat/>
+    <w:rsid w:val="003859C6"/>
   </w:style>
   <w:style w:type="paragraph" w:styleId="Heading1">
     <w:name w:val="heading 1"/>

</xml_diff>